<commit_message>
Added Back Button, wrote SelfReflection and updates db first setup
</commit_message>
<xml_diff>
--- a/Docs/API Leírás.docx
+++ b/Docs/API Leírás.docx
@@ -2,13 +2,6 @@
 <file path=word/document.xml><?xml version="1.0" encoding="utf-8"?>
 <w:document xmlns:wpc="http://schemas.microsoft.com/office/word/2010/wordprocessingCanvas" xmlns:cx="http://schemas.microsoft.com/office/drawing/2014/chartex" xmlns:cx1="http://schemas.microsoft.com/office/drawing/2015/9/8/chartex" xmlns:cx2="http://schemas.microsoft.com/office/drawing/2015/10/21/chartex" xmlns:cx3="http://schemas.microsoft.com/office/drawing/2016/5/9/chartex" xmlns:cx4="http://schemas.microsoft.com/office/drawing/2016/5/10/chartex" xmlns:cx5="http://schemas.microsoft.com/office/drawing/2016/5/11/chartex" xmlns:cx6="http://schemas.microsoft.com/office/drawing/2016/5/12/chartex" xmlns:cx7="http://schemas.microsoft.com/office/drawing/2016/5/13/chartex" xmlns:cx8="http://schemas.microsoft.com/office/drawing/2016/5/14/chartex" xmlns:mc="http://schemas.openxmlformats.org/markup-compatibility/2006" xmlns:aink="http://schemas.microsoft.com/office/drawing/2016/ink" xmlns:am3d="http://schemas.microsoft.com/office/drawing/2017/model3d" xmlns:o="urn:schemas-microsoft-com:office:office" xmlns:oel="http://schemas.microsoft.com/office/2019/extlst" xmlns:r="http://schemas.openxmlformats.org/officeDocument/2006/relationships" xmlns:m="http://schemas.openxmlformats.org/officeDocument/2006/math" xmlns:v="urn:schemas-microsoft-com:vml" xmlns:wp14="http://schemas.microsoft.com/office/word/2010/wordprocessingDrawing" xmlns:wp="http://schemas.openxmlformats.org/drawingml/2006/wordprocessingDrawing" xmlns:w10="urn:schemas-microsoft-com:office:word" xmlns:w="http://schemas.openxmlformats.org/wordprocessingml/2006/main" xmlns:w14="http://schemas.microsoft.com/office/word/2010/wordml" xmlns:w15="http://schemas.microsoft.com/office/word/2012/wordml" xmlns:w16cei="http://schemas.microsoft.com/office/word/2026/wordml/cei" xmlns:w16cex="http://schemas.microsoft.com/office/word/2018/wordml/cex" xmlns:w16cid="http://schemas.microsoft.com/office/word/2016/wordml/cid" xmlns:w16="http://schemas.microsoft.com/office/word/2018/wordml" xmlns:w16du="http://schemas.microsoft.com/office/word/2023/wordml/word16du" xmlns:w16sdtdh="http://schemas.microsoft.com/office/word/2020/wordml/sdtdatahash" xmlns:w16sdtfl="http://schemas.microsoft.com/office/word/2024/wordml/sdtformatlock" xmlns:w16se="http://schemas.microsoft.com/office/word/2015/wordml/symex" xmlns:wpg="http://schemas.microsoft.com/office/word/2010/wordprocessingGroup" xmlns:wpi="http://schemas.microsoft.com/office/word/2010/wordprocessingInk" xmlns:wne="http://schemas.microsoft.com/office/word/2006/wordml" xmlns:wps="http://schemas.microsoft.com/office/word/2010/wordprocessingShape" mc:Ignorable="w14 w15 w16se w16cid w16 w16cex w16sdtdh w16sdtfl w16du wp14">
   <w:body>
-    <w:p>
-      <w:pPr>
-        <w:pStyle w:val="Title"/>
-        <w:spacing w:after="0"/>
-        <w:jc w:val="center"/>
-      </w:pPr>
-    </w:p>
     <w:p>
       <w:pPr>
         <w:pStyle w:val="Title"/>
@@ -457,15 +450,10 @@
       </w:r>
       <w:proofErr w:type="spellEnd"/>
       <w:r>
-        <w:t xml:space="preserve"> Id-t (int), a Sort (int Row) </w:t>
-      </w:r>
-      <w:proofErr w:type="spellStart"/>
-      <w:r>
-        <w:t>és</w:t>
-      </w:r>
-      <w:proofErr w:type="spellEnd"/>
-      <w:r>
-        <w:t xml:space="preserve"> </w:t>
+        <w:t xml:space="preserve"> Id-t (int), a Sort (int Row)</w:t>
+      </w:r>
+      <w:r>
+        <w:t xml:space="preserve">, </w:t>
       </w:r>
       <w:proofErr w:type="spellStart"/>
       <w:r>
@@ -481,7 +469,50 @@
       </w:r>
       <w:proofErr w:type="spellEnd"/>
       <w:r>
-        <w:t xml:space="preserve"> (int Column).</w:t>
+        <w:t xml:space="preserve"> (int Column)</w:t>
+      </w:r>
+      <w:r>
+        <w:t xml:space="preserve"> </w:t>
+      </w:r>
+      <w:proofErr w:type="spellStart"/>
+      <w:r>
+        <w:t>illetve</w:t>
+      </w:r>
+      <w:proofErr w:type="spellEnd"/>
+      <w:r>
+        <w:t xml:space="preserve"> </w:t>
+      </w:r>
+      <w:proofErr w:type="spellStart"/>
+      <w:r>
+        <w:t>hogy</w:t>
+      </w:r>
+      <w:proofErr w:type="spellEnd"/>
+      <w:r>
+        <w:t xml:space="preserve"> </w:t>
+      </w:r>
+      <w:proofErr w:type="spellStart"/>
+      <w:r>
+        <w:t>rendelkezik</w:t>
+      </w:r>
+      <w:proofErr w:type="spellEnd"/>
+      <w:r>
+        <w:t xml:space="preserve">-e </w:t>
+      </w:r>
+      <w:proofErr w:type="spellStart"/>
+      <w:r>
+        <w:t>elektromos</w:t>
+      </w:r>
+      <w:proofErr w:type="spellEnd"/>
+      <w:r>
+        <w:t xml:space="preserve"> </w:t>
+      </w:r>
+      <w:proofErr w:type="spellStart"/>
+      <w:r>
+        <w:t>töltővel</w:t>
+      </w:r>
+      <w:proofErr w:type="spellEnd"/>
+      <w:r>
+        <w:t>.</w:t>
       </w:r>
     </w:p>
     <w:p>
@@ -525,7 +556,29 @@
         <w:t xml:space="preserve"> </w:t>
       </w:r>
       <w:r>
-        <w:t>$"Spot {Id}"</w:t>
+        <w:t>$"Spot {Id}</w:t>
+      </w:r>
+      <w:r>
+        <w:t xml:space="preserve"> {(</w:t>
+      </w:r>
+      <w:proofErr w:type="gramStart"/>
+      <w:r>
+        <w:t>Electric ?</w:t>
+      </w:r>
+      <w:proofErr w:type="gramEnd"/>
+      <w:r>
+        <w:t xml:space="preserve"> “- Electric</w:t>
+      </w:r>
+      <w:proofErr w:type="gramStart"/>
+      <w:r>
+        <w:t>” :</w:t>
+      </w:r>
+      <w:proofErr w:type="gramEnd"/>
+      <w:r>
+        <w:t xml:space="preserve"> “”)}</w:t>
+      </w:r>
+      <w:r>
+        <w:t>"</w:t>
       </w:r>
       <w:r>
         <w:t xml:space="preserve">, </w:t>
@@ -1083,10 +1136,7 @@
       </w:r>
       <w:proofErr w:type="gramStart"/>
       <w:r>
-        <w:t>static</w:t>
-      </w:r>
-      <w:r>
-        <w:t xml:space="preserve">  </w:t>
+        <w:t xml:space="preserve">static  </w:t>
       </w:r>
       <w:r>
         <w:t>async</w:t>
@@ -1160,10 +1210,7 @@
       </w:pPr>
       <w:proofErr w:type="spellStart"/>
       <w:r>
-        <w:t>DbApi.</w:t>
-      </w:r>
-      <w:r>
-        <w:t>GetFreeParkingSpots</w:t>
+        <w:t>DbApi.GetFreeParkingSpots</w:t>
       </w:r>
       <w:proofErr w:type="spellEnd"/>
       <w:r>
@@ -1199,13 +1246,7 @@
       </w:r>
       <w:proofErr w:type="spellEnd"/>
       <w:r>
-        <w:t xml:space="preserve">): </w:t>
-      </w:r>
-      <w:r>
-        <w:t>static</w:t>
-      </w:r>
-      <w:r>
-        <w:t xml:space="preserve"> async Task&lt;List&lt;</w:t>
+        <w:t>): static async Task&lt;List&lt;</w:t>
       </w:r>
       <w:proofErr w:type="spellStart"/>
       <w:r>
@@ -1244,13 +1285,7 @@
         <w:rPr>
           <w:lang w:val="hu-HU"/>
         </w:rPr>
-        <w:t>át a</w:t>
-      </w:r>
-      <w:r>
-        <w:rPr>
-          <w:lang w:val="hu-HU"/>
-        </w:rPr>
-        <w:t>zokkal a parkolóhelyekkel, melyek szabadok startingTime és endingTime között.</w:t>
+        <w:t>át azokkal a parkolóhelyekkel, melyek szabadok startingTime és endingTime között.</w:t>
       </w:r>
     </w:p>
     <w:p>
@@ -1263,34 +1298,51 @@
       </w:pPr>
       <w:proofErr w:type="spellStart"/>
       <w:r>
-        <w:t>DbApi.Get</w:t>
-      </w:r>
-      <w:r>
-        <w:t>Reservations</w:t>
-      </w:r>
-      <w:proofErr w:type="spellEnd"/>
-      <w:r>
-        <w:t>(): static</w:t>
-      </w:r>
-      <w:r>
-        <w:t xml:space="preserve"> </w:t>
-      </w:r>
-      <w:r>
-        <w:t>async Task&lt;List&lt;</w:t>
-      </w:r>
-      <w:r>
-        <w:t xml:space="preserve"> </w:t>
-      </w:r>
-      <w:proofErr w:type="spellStart"/>
-      <w:r>
-        <w:t>ParkingSpotReservation</w:t>
-      </w:r>
-      <w:proofErr w:type="spellEnd"/>
-      <w:r>
-        <w:t xml:space="preserve"> </w:t>
-      </w:r>
-      <w:r>
-        <w:t xml:space="preserve">&gt;&gt; </w:t>
+        <w:t>DbApi.GetFreeElectricParkingSpots</w:t>
+      </w:r>
+      <w:proofErr w:type="spellEnd"/>
+      <w:r>
+        <w:t>(</w:t>
+      </w:r>
+      <w:proofErr w:type="spellStart"/>
+      <w:r>
+        <w:t>DateTime</w:t>
+      </w:r>
+      <w:proofErr w:type="spellEnd"/>
+      <w:r>
+        <w:t xml:space="preserve"> </w:t>
+      </w:r>
+      <w:proofErr w:type="spellStart"/>
+      <w:r>
+        <w:t>startingTime</w:t>
+      </w:r>
+      <w:proofErr w:type="spellEnd"/>
+      <w:r>
+        <w:t xml:space="preserve">, </w:t>
+      </w:r>
+      <w:proofErr w:type="spellStart"/>
+      <w:r>
+        <w:t>DateTime</w:t>
+      </w:r>
+      <w:proofErr w:type="spellEnd"/>
+      <w:r>
+        <w:t xml:space="preserve"> </w:t>
+      </w:r>
+      <w:proofErr w:type="spellStart"/>
+      <w:r>
+        <w:t>endingTime</w:t>
+      </w:r>
+      <w:proofErr w:type="spellEnd"/>
+      <w:r>
+        <w:t>): static async Task&lt;List&lt;</w:t>
+      </w:r>
+      <w:proofErr w:type="spellStart"/>
+      <w:r>
+        <w:t>ParkingSpot</w:t>
+      </w:r>
+      <w:proofErr w:type="spellEnd"/>
+      <w:r>
+        <w:t>&gt;&gt;</w:t>
       </w:r>
     </w:p>
     <w:p>
@@ -1321,13 +1373,19 @@
         <w:rPr>
           <w:lang w:val="hu-HU"/>
         </w:rPr>
-        <w:t xml:space="preserve">át az összes </w:t>
+        <w:t>át azokkal a parkolóhelyekkel, melyek szabadok startingTime és endingTime között</w:t>
       </w:r>
       <w:r>
         <w:rPr>
           <w:lang w:val="hu-HU"/>
         </w:rPr>
-        <w:t>foglalással</w:t>
+        <w:t>, és rendelkeznek elektromos töltővel</w:t>
+      </w:r>
+      <w:r>
+        <w:rPr>
+          <w:lang w:val="hu-HU"/>
+        </w:rPr>
+        <w:t>.</w:t>
       </w:r>
     </w:p>
     <w:p>
@@ -1340,39 +1398,52 @@
       </w:pPr>
       <w:proofErr w:type="spellStart"/>
       <w:r>
-        <w:t>DbApi.Get</w:t>
-      </w:r>
-      <w:r>
-        <w:t>Reservation</w:t>
-      </w:r>
-      <w:proofErr w:type="spellEnd"/>
-      <w:r>
-        <w:t xml:space="preserve">(int </w:t>
-      </w:r>
-      <w:proofErr w:type="spellStart"/>
-      <w:r>
-        <w:t>reservationI</w:t>
-      </w:r>
-      <w:r>
-        <w:t>d</w:t>
-      </w:r>
-      <w:proofErr w:type="spellEnd"/>
-      <w:r>
-        <w:t>): static</w:t>
-      </w:r>
-      <w:r>
-        <w:t xml:space="preserve"> </w:t>
-      </w:r>
-      <w:r>
-        <w:t>async Task&lt;</w:t>
-      </w:r>
-      <w:proofErr w:type="spellStart"/>
-      <w:r>
-        <w:t>ParkingSpotReservation</w:t>
-      </w:r>
-      <w:proofErr w:type="spellEnd"/>
-      <w:r>
-        <w:t>&gt;</w:t>
+        <w:lastRenderedPageBreak/>
+        <w:t>DbApi.GetFreeNormalParkingSpots</w:t>
+      </w:r>
+      <w:proofErr w:type="spellEnd"/>
+      <w:r>
+        <w:t>(</w:t>
+      </w:r>
+      <w:proofErr w:type="spellStart"/>
+      <w:r>
+        <w:t>DateTime</w:t>
+      </w:r>
+      <w:proofErr w:type="spellEnd"/>
+      <w:r>
+        <w:t xml:space="preserve"> </w:t>
+      </w:r>
+      <w:proofErr w:type="spellStart"/>
+      <w:r>
+        <w:t>startingTime</w:t>
+      </w:r>
+      <w:proofErr w:type="spellEnd"/>
+      <w:r>
+        <w:t xml:space="preserve">, </w:t>
+      </w:r>
+      <w:proofErr w:type="spellStart"/>
+      <w:r>
+        <w:t>DateTime</w:t>
+      </w:r>
+      <w:proofErr w:type="spellEnd"/>
+      <w:r>
+        <w:t xml:space="preserve"> </w:t>
+      </w:r>
+      <w:proofErr w:type="spellStart"/>
+      <w:r>
+        <w:t>endingTime</w:t>
+      </w:r>
+      <w:proofErr w:type="spellEnd"/>
+      <w:r>
+        <w:t>): static async Task&lt;List&lt;</w:t>
+      </w:r>
+      <w:proofErr w:type="spellStart"/>
+      <w:r>
+        <w:t>ParkingSpot</w:t>
+      </w:r>
+      <w:proofErr w:type="spellEnd"/>
+      <w:r>
+        <w:t>&gt;&gt;</w:t>
       </w:r>
     </w:p>
     <w:p>
@@ -1385,53 +1456,38 @@
       </w:pPr>
       <w:proofErr w:type="spellStart"/>
       <w:r>
-        <w:t>Visszaadja</w:t>
-      </w:r>
-      <w:proofErr w:type="spellEnd"/>
-      <w:r>
-        <w:t xml:space="preserve"> </w:t>
-      </w:r>
-      <w:proofErr w:type="spellStart"/>
-      <w:r>
-        <w:t>az</w:t>
-      </w:r>
-      <w:proofErr w:type="spellEnd"/>
-      <w:r>
-        <w:t xml:space="preserve"> </w:t>
-      </w:r>
-      <w:proofErr w:type="spellStart"/>
-      <w:r>
-        <w:t>reservationId</w:t>
-      </w:r>
-      <w:proofErr w:type="spellEnd"/>
-      <w:r>
-        <w:t xml:space="preserve"> Id-</w:t>
-      </w:r>
-      <w:proofErr w:type="spellStart"/>
-      <w:r>
-        <w:t>jű</w:t>
-      </w:r>
-      <w:proofErr w:type="spellEnd"/>
-      <w:r>
-        <w:t xml:space="preserve"> </w:t>
-      </w:r>
-      <w:proofErr w:type="spellStart"/>
-      <w:r>
-        <w:t>foglal</w:t>
-      </w:r>
-      <w:proofErr w:type="spellEnd"/>
+        <w:t>Visszaad</w:t>
+      </w:r>
+      <w:proofErr w:type="spellEnd"/>
+      <w:r>
+        <w:t xml:space="preserve"> </w:t>
+      </w:r>
+      <w:proofErr w:type="spellStart"/>
+      <w:r>
+        <w:t>egy</w:t>
+      </w:r>
+      <w:proofErr w:type="spellEnd"/>
+      <w:r>
+        <w:t xml:space="preserve"> list</w:t>
+      </w:r>
       <w:r>
         <w:rPr>
           <w:lang w:val="hu-HU"/>
         </w:rPr>
-        <w:t>ást</w:t>
-      </w:r>
-    </w:p>
-    <w:p>
-      <w:pPr>
-        <w:pStyle w:val="ListParagraph"/>
-        <w:ind w:left="1800"/>
-      </w:pPr>
+        <w:t>át azokkal a parkolóhelyekkel, melyek szabadok startingTime és endingTime között</w:t>
+      </w:r>
+      <w:r>
+        <w:rPr>
+          <w:lang w:val="hu-HU"/>
+        </w:rPr>
+        <w:t>, és nem rendelkeznek elektromos töltővel</w:t>
+      </w:r>
+      <w:r>
+        <w:rPr>
+          <w:lang w:val="hu-HU"/>
+        </w:rPr>
+        <w:t>.</w:t>
+      </w:r>
     </w:p>
     <w:p>
       <w:pPr>
@@ -1443,38 +1499,14 @@
       </w:pPr>
       <w:proofErr w:type="spellStart"/>
       <w:r>
-        <w:lastRenderedPageBreak/>
-        <w:t>DbApi.</w:t>
-      </w:r>
-      <w:r>
-        <w:t>GetReservations</w:t>
-      </w:r>
-      <w:r>
-        <w:t>ForSpot</w:t>
-      </w:r>
-      <w:proofErr w:type="spellEnd"/>
-      <w:r>
-        <w:t>(</w:t>
-      </w:r>
-      <w:proofErr w:type="spellStart"/>
-      <w:r>
-        <w:t>ParkingSpot</w:t>
-      </w:r>
-      <w:proofErr w:type="spellEnd"/>
-      <w:r>
-        <w:t xml:space="preserve"> spot</w:t>
-      </w:r>
-      <w:r>
-        <w:t>): static</w:t>
-      </w:r>
-      <w:r>
-        <w:t xml:space="preserve"> </w:t>
-      </w:r>
-      <w:r>
-        <w:t>async Task&lt;Lis</w:t>
-      </w:r>
-      <w:r>
-        <w:t>t&lt;</w:t>
+        <w:t>DbApi.GetReservations</w:t>
+      </w:r>
+      <w:proofErr w:type="spellEnd"/>
+      <w:r>
+        <w:t>(): static async Task&lt;List&lt;</w:t>
+      </w:r>
+      <w:r>
+        <w:t xml:space="preserve"> </w:t>
       </w:r>
       <w:proofErr w:type="spellStart"/>
       <w:r>
@@ -1513,19 +1545,156 @@
         <w:rPr>
           <w:lang w:val="hu-HU"/>
         </w:rPr>
-        <w:t xml:space="preserve">át az összes </w:t>
-      </w:r>
+        <w:t>át az összes foglalással</w:t>
+      </w:r>
+    </w:p>
+    <w:p>
+      <w:pPr>
+        <w:pStyle w:val="ListParagraph"/>
+        <w:numPr>
+          <w:ilvl w:val="1"/>
+          <w:numId w:val="9"/>
+        </w:numPr>
+      </w:pPr>
+      <w:proofErr w:type="spellStart"/>
+      <w:r>
+        <w:t>DbApi.GetReservation</w:t>
+      </w:r>
+      <w:proofErr w:type="spellEnd"/>
+      <w:r>
+        <w:t xml:space="preserve">(int </w:t>
+      </w:r>
+      <w:proofErr w:type="spellStart"/>
+      <w:r>
+        <w:t>reservationId</w:t>
+      </w:r>
+      <w:proofErr w:type="spellEnd"/>
+      <w:r>
+        <w:t>): static async Task&lt;</w:t>
+      </w:r>
+      <w:proofErr w:type="spellStart"/>
+      <w:r>
+        <w:t>ParkingSpotReservation</w:t>
+      </w:r>
+      <w:proofErr w:type="spellEnd"/>
+      <w:r>
+        <w:t>&gt;</w:t>
+      </w:r>
+    </w:p>
+    <w:p>
+      <w:pPr>
+        <w:pStyle w:val="ListParagraph"/>
+        <w:numPr>
+          <w:ilvl w:val="2"/>
+          <w:numId w:val="9"/>
+        </w:numPr>
+      </w:pPr>
+      <w:proofErr w:type="spellStart"/>
+      <w:r>
+        <w:t>Visszaadja</w:t>
+      </w:r>
+      <w:proofErr w:type="spellEnd"/>
+      <w:r>
+        <w:t xml:space="preserve"> </w:t>
+      </w:r>
+      <w:proofErr w:type="spellStart"/>
+      <w:r>
+        <w:t>az</w:t>
+      </w:r>
+      <w:proofErr w:type="spellEnd"/>
+      <w:r>
+        <w:t xml:space="preserve"> </w:t>
+      </w:r>
+      <w:proofErr w:type="spellStart"/>
+      <w:r>
+        <w:t>reservationId</w:t>
+      </w:r>
+      <w:proofErr w:type="spellEnd"/>
+      <w:r>
+        <w:t xml:space="preserve"> Id-</w:t>
+      </w:r>
+      <w:proofErr w:type="spellStart"/>
+      <w:r>
+        <w:t>jű</w:t>
+      </w:r>
+      <w:proofErr w:type="spellEnd"/>
+      <w:r>
+        <w:t xml:space="preserve"> </w:t>
+      </w:r>
+      <w:proofErr w:type="spellStart"/>
+      <w:r>
+        <w:t>foglal</w:t>
+      </w:r>
+      <w:proofErr w:type="spellEnd"/>
       <w:r>
         <w:rPr>
           <w:lang w:val="hu-HU"/>
         </w:rPr>
-        <w:t xml:space="preserve">spot parkolóhelyre szóló </w:t>
+        <w:t>ást</w:t>
+      </w:r>
+    </w:p>
+    <w:p>
+      <w:pPr>
+        <w:pStyle w:val="ListParagraph"/>
+        <w:numPr>
+          <w:ilvl w:val="1"/>
+          <w:numId w:val="9"/>
+        </w:numPr>
+      </w:pPr>
+      <w:proofErr w:type="spellStart"/>
+      <w:r>
+        <w:t>DbApi.GetReservationsForSpot</w:t>
+      </w:r>
+      <w:proofErr w:type="spellEnd"/>
+      <w:r>
+        <w:t>(</w:t>
+      </w:r>
+      <w:proofErr w:type="spellStart"/>
+      <w:r>
+        <w:t>ParkingSpot</w:t>
+      </w:r>
+      <w:proofErr w:type="spellEnd"/>
+      <w:r>
+        <w:t xml:space="preserve"> spot): static async Task&lt;List&lt;</w:t>
+      </w:r>
+      <w:proofErr w:type="spellStart"/>
+      <w:r>
+        <w:t>ParkingSpotReservation</w:t>
+      </w:r>
+      <w:proofErr w:type="spellEnd"/>
+      <w:r>
+        <w:t xml:space="preserve"> &gt;&gt; </w:t>
+      </w:r>
+    </w:p>
+    <w:p>
+      <w:pPr>
+        <w:pStyle w:val="ListParagraph"/>
+        <w:numPr>
+          <w:ilvl w:val="2"/>
+          <w:numId w:val="9"/>
+        </w:numPr>
+      </w:pPr>
+      <w:proofErr w:type="spellStart"/>
+      <w:r>
+        <w:t>Visszaad</w:t>
+      </w:r>
+      <w:proofErr w:type="spellEnd"/>
+      <w:r>
+        <w:t xml:space="preserve"> </w:t>
+      </w:r>
+      <w:proofErr w:type="spellStart"/>
+      <w:r>
+        <w:t>egy</w:t>
+      </w:r>
+      <w:proofErr w:type="spellEnd"/>
+      <w:r>
+        <w:t xml:space="preserve"> list</w:t>
       </w:r>
       <w:r>
         <w:rPr>
           <w:lang w:val="hu-HU"/>
         </w:rPr>
-        <w:t>foglalással</w:t>
+        <w:t>át az összes spot parkolóhelyre szóló foglalással</w:t>
       </w:r>
     </w:p>
     <w:p>
@@ -1583,13 +1752,7 @@
       </w:pPr>
       <w:proofErr w:type="spellStart"/>
       <w:r>
-        <w:t>DbApi.</w:t>
-      </w:r>
-      <w:r>
-        <w:t>Remove</w:t>
-      </w:r>
-      <w:r>
-        <w:t>ParkingSpot</w:t>
+        <w:t>DbApi.RemoveParkingSpot</w:t>
       </w:r>
       <w:proofErr w:type="spellEnd"/>
       <w:r>
@@ -1621,13 +1784,7 @@
         <w:rPr>
           <w:lang w:val="hu-HU"/>
         </w:rPr>
-        <w:t xml:space="preserve"> a spot parkolóhelyet az adatbázis</w:t>
-      </w:r>
-      <w:r>
-        <w:rPr>
-          <w:lang w:val="hu-HU"/>
-        </w:rPr>
-        <w:t>ból</w:t>
+        <w:t xml:space="preserve"> a spot parkolóhelyet az adatbázisból</w:t>
       </w:r>
     </w:p>
     <w:p>
@@ -1640,10 +1797,7 @@
       </w:pPr>
       <w:proofErr w:type="spellStart"/>
       <w:r>
-        <w:t>DbApi.Ad</w:t>
-      </w:r>
-      <w:r>
-        <w:t>dReservation</w:t>
+        <w:t>DbApi.AddReservation</w:t>
       </w:r>
       <w:proofErr w:type="spellEnd"/>
       <w:r>
@@ -1651,20 +1805,11 @@
       </w:r>
       <w:proofErr w:type="spellStart"/>
       <w:r>
-        <w:t>ParkingSpot</w:t>
-      </w:r>
-      <w:r>
-        <w:t>Reservation</w:t>
-      </w:r>
-      <w:proofErr w:type="spellEnd"/>
-      <w:r>
-        <w:t xml:space="preserve"> </w:t>
-      </w:r>
-      <w:r>
-        <w:t>reservation</w:t>
-      </w:r>
-      <w:r>
-        <w:t>): static async Task</w:t>
+        <w:t>ParkingSpotReservation</w:t>
+      </w:r>
+      <w:proofErr w:type="spellEnd"/>
+      <w:r>
+        <w:t xml:space="preserve"> reservation): static async Task</w:t>
       </w:r>
     </w:p>
     <w:p>
@@ -1684,31 +1829,7 @@
         <w:rPr>
           <w:lang w:val="hu-HU"/>
         </w:rPr>
-        <w:t xml:space="preserve">áadja a </w:t>
-      </w:r>
-      <w:r>
-        <w:rPr>
-          <w:lang w:val="hu-HU"/>
-        </w:rPr>
-        <w:t>reservation</w:t>
-      </w:r>
-      <w:r>
-        <w:rPr>
-          <w:lang w:val="hu-HU"/>
-        </w:rPr>
-        <w:t xml:space="preserve"> </w:t>
-      </w:r>
-      <w:r>
-        <w:rPr>
-          <w:lang w:val="hu-HU"/>
-        </w:rPr>
-        <w:t>foglalást</w:t>
-      </w:r>
-      <w:r>
-        <w:rPr>
-          <w:lang w:val="hu-HU"/>
-        </w:rPr>
-        <w:t xml:space="preserve"> az adatbázishoz</w:t>
+        <w:t>áadja a reservation foglalást az adatbázishoz</w:t>
       </w:r>
     </w:p>
     <w:p>
@@ -1721,13 +1842,7 @@
       </w:pPr>
       <w:proofErr w:type="spellStart"/>
       <w:r>
-        <w:t>DbApi.</w:t>
-      </w:r>
-      <w:r>
-        <w:t>Remove</w:t>
-      </w:r>
-      <w:r>
-        <w:t>Reservation</w:t>
+        <w:t>DbApi.RemoveReservation</w:t>
       </w:r>
       <w:proofErr w:type="spellEnd"/>
       <w:r>
@@ -1759,13 +1874,7 @@
         <w:rPr>
           <w:lang w:val="hu-HU"/>
         </w:rPr>
-        <w:t xml:space="preserve"> a reservation foglalást az adatbázis</w:t>
-      </w:r>
-      <w:r>
-        <w:rPr>
-          <w:lang w:val="hu-HU"/>
-        </w:rPr>
-        <w:t>ból</w:t>
+        <w:t xml:space="preserve"> a reservation foglalást az adatbázisból</w:t>
       </w:r>
     </w:p>
     <w:p>
@@ -2034,6 +2143,7 @@
         </w:numPr>
       </w:pPr>
       <w:r>
+        <w:lastRenderedPageBreak/>
         <w:t xml:space="preserve">Ha </w:t>
       </w:r>
       <w:proofErr w:type="spellStart"/>
@@ -2144,13 +2254,7 @@
       <w:proofErr w:type="spellStart"/>
       <w:proofErr w:type="gramStart"/>
       <w:r>
-        <w:t>Try</w:t>
-      </w:r>
-      <w:r>
-        <w:t>Remove</w:t>
-      </w:r>
-      <w:r>
-        <w:t>Reservation</w:t>
+        <w:t>TryRemoveReservation</w:t>
       </w:r>
       <w:proofErr w:type="spellEnd"/>
       <w:r>
@@ -2158,10 +2262,7 @@
       </w:r>
       <w:proofErr w:type="gramEnd"/>
       <w:r>
-        <w:t>string user,</w:t>
-      </w:r>
-      <w:r>
-        <w:t xml:space="preserve"> </w:t>
+        <w:t xml:space="preserve">string user, </w:t>
       </w:r>
       <w:proofErr w:type="spellStart"/>
       <w:r>
@@ -2169,10 +2270,7 @@
       </w:r>
       <w:proofErr w:type="spellEnd"/>
       <w:r>
-        <w:t xml:space="preserve"> reservation</w:t>
-      </w:r>
-      <w:r>
-        <w:t>): static async Task</w:t>
+        <w:t xml:space="preserve"> reservation): static async Task</w:t>
       </w:r>
     </w:p>
     <w:p>
@@ -2190,19 +2288,7 @@
         <w:rPr>
           <w:lang w:val="hu-HU"/>
         </w:rPr>
-        <w:t xml:space="preserve">üggvény felelős egy foglalás </w:t>
-      </w:r>
-      <w:r>
-        <w:rPr>
-          <w:lang w:val="hu-HU"/>
-        </w:rPr>
-        <w:t>kitörléséért</w:t>
-      </w:r>
-      <w:r>
-        <w:rPr>
-          <w:lang w:val="hu-HU"/>
-        </w:rPr>
-        <w:t>.</w:t>
+        <w:t>üggvény felelős egy foglalás kitörléséért.</w:t>
       </w:r>
     </w:p>
     <w:p>
@@ -2217,31 +2303,7 @@
         <w:rPr>
           <w:lang w:val="hu-HU"/>
         </w:rPr>
-        <w:t xml:space="preserve">Leellenőrzi, hogy a </w:t>
-      </w:r>
-      <w:r>
-        <w:rPr>
-          <w:lang w:val="hu-HU"/>
-        </w:rPr>
-        <w:t>felhasználónak van-</w:t>
-      </w:r>
-      <w:r>
-        <w:rPr>
-          <w:lang w:val="hu-HU"/>
-        </w:rPr>
-        <w:t>e</w:t>
-      </w:r>
-      <w:r>
-        <w:rPr>
-          <w:lang w:val="hu-HU"/>
-        </w:rPr>
-        <w:t xml:space="preserve"> joga kitörölni</w:t>
-      </w:r>
-      <w:r>
-        <w:rPr>
-          <w:lang w:val="hu-HU"/>
-        </w:rPr>
-        <w:t>:</w:t>
+        <w:t>Leellenőrzi, hogy a felhasználónak van-e joga kitörölni:</w:t>
       </w:r>
     </w:p>
     <w:p>
@@ -2292,13 +2354,7 @@
         <w:rPr>
           <w:lang w:val="hu-HU"/>
         </w:rPr>
-        <w:t xml:space="preserve">Ha elbukik, </w:t>
-      </w:r>
-      <w:r>
-        <w:rPr>
-          <w:lang w:val="hu-HU"/>
-        </w:rPr>
-        <w:t>Exceptiont dob hibaüzenettel</w:t>
+        <w:t>Ha elbukik, Exceptiont dob hibaüzenettel</w:t>
       </w:r>
     </w:p>
     <w:p>
@@ -2310,7 +2366,6 @@
         </w:numPr>
       </w:pPr>
       <w:r>
-        <w:lastRenderedPageBreak/>
         <w:t xml:space="preserve">Ha </w:t>
       </w:r>
       <w:proofErr w:type="spellStart"/>
@@ -2412,8 +2467,12 @@
     </w:p>
     <w:p/>
     <w:sectPr>
-      <w:footerReference w:type="default" r:id="rId8"/>
-      <w:footerReference w:type="first" r:id="rId9"/>
+      <w:headerReference w:type="even" r:id="rId8"/>
+      <w:headerReference w:type="default" r:id="rId9"/>
+      <w:footerReference w:type="even" r:id="rId10"/>
+      <w:footerReference w:type="default" r:id="rId11"/>
+      <w:headerReference w:type="first" r:id="rId12"/>
+      <w:footerReference w:type="first" r:id="rId13"/>
       <w:pgSz w:w="12240" w:h="15840"/>
       <w:pgMar w:top="1440" w:right="1440" w:bottom="1440" w:left="1440" w:header="720" w:footer="720" w:gutter="0"/>
       <w:pgNumType w:start="0" w:chapStyle="1"/>
@@ -2451,6 +2510,16 @@
 </file>
 
 <file path=word/footer1.xml><?xml version="1.0" encoding="utf-8"?>
+<w:ftr xmlns:wpc="http://schemas.microsoft.com/office/word/2010/wordprocessingCanvas" xmlns:cx="http://schemas.microsoft.com/office/drawing/2014/chartex" xmlns:cx1="http://schemas.microsoft.com/office/drawing/2015/9/8/chartex" xmlns:cx2="http://schemas.microsoft.com/office/drawing/2015/10/21/chartex" xmlns:cx3="http://schemas.microsoft.com/office/drawing/2016/5/9/chartex" xmlns:cx4="http://schemas.microsoft.com/office/drawing/2016/5/10/chartex" xmlns:cx5="http://schemas.microsoft.com/office/drawing/2016/5/11/chartex" xmlns:cx6="http://schemas.microsoft.com/office/drawing/2016/5/12/chartex" xmlns:cx7="http://schemas.microsoft.com/office/drawing/2016/5/13/chartex" xmlns:cx8="http://schemas.microsoft.com/office/drawing/2016/5/14/chartex" xmlns:mc="http://schemas.openxmlformats.org/markup-compatibility/2006" xmlns:aink="http://schemas.microsoft.com/office/drawing/2016/ink" xmlns:am3d="http://schemas.microsoft.com/office/drawing/2017/model3d" xmlns:o="urn:schemas-microsoft-com:office:office" xmlns:oel="http://schemas.microsoft.com/office/2019/extlst" xmlns:r="http://schemas.openxmlformats.org/officeDocument/2006/relationships" xmlns:m="http://schemas.openxmlformats.org/officeDocument/2006/math" xmlns:v="urn:schemas-microsoft-com:vml" xmlns:wp14="http://schemas.microsoft.com/office/word/2010/wordprocessingDrawing" xmlns:wp="http://schemas.openxmlformats.org/drawingml/2006/wordprocessingDrawing" xmlns:w10="urn:schemas-microsoft-com:office:word" xmlns:w="http://schemas.openxmlformats.org/wordprocessingml/2006/main" xmlns:w14="http://schemas.microsoft.com/office/word/2010/wordml" xmlns:w15="http://schemas.microsoft.com/office/word/2012/wordml" xmlns:w16cei="http://schemas.microsoft.com/office/word/2026/wordml/cei" xmlns:w16cex="http://schemas.microsoft.com/office/word/2018/wordml/cex" xmlns:w16cid="http://schemas.microsoft.com/office/word/2016/wordml/cid" xmlns:w16="http://schemas.microsoft.com/office/word/2018/wordml" xmlns:w16du="http://schemas.microsoft.com/office/word/2023/wordml/word16du" xmlns:w16sdtdh="http://schemas.microsoft.com/office/word/2020/wordml/sdtdatahash" xmlns:w16sdtfl="http://schemas.microsoft.com/office/word/2024/wordml/sdtformatlock" xmlns:w16se="http://schemas.microsoft.com/office/word/2015/wordml/symex" xmlns:wpg="http://schemas.microsoft.com/office/word/2010/wordprocessingGroup" xmlns:wpi="http://schemas.microsoft.com/office/word/2010/wordprocessingInk" xmlns:wne="http://schemas.microsoft.com/office/word/2006/wordml" xmlns:wps="http://schemas.microsoft.com/office/word/2010/wordprocessingShape" mc:Ignorable="w14 w15 w16se w16cid w16 w16cex w16sdtdh w16sdtfl w16du wp14">
+  <w:p>
+    <w:pPr>
+      <w:pStyle w:val="Footer"/>
+    </w:pPr>
+  </w:p>
+</w:ftr>
+</file>
+
+<file path=word/footer2.xml><?xml version="1.0" encoding="utf-8"?>
 <w:ftr xmlns:wpc="http://schemas.microsoft.com/office/word/2010/wordprocessingCanvas" xmlns:cx="http://schemas.microsoft.com/office/drawing/2014/chartex" xmlns:cx1="http://schemas.microsoft.com/office/drawing/2015/9/8/chartex" xmlns:cx2="http://schemas.microsoft.com/office/drawing/2015/10/21/chartex" xmlns:cx3="http://schemas.microsoft.com/office/drawing/2016/5/9/chartex" xmlns:cx4="http://schemas.microsoft.com/office/drawing/2016/5/10/chartex" xmlns:cx5="http://schemas.microsoft.com/office/drawing/2016/5/11/chartex" xmlns:cx6="http://schemas.microsoft.com/office/drawing/2016/5/12/chartex" xmlns:cx7="http://schemas.microsoft.com/office/drawing/2016/5/13/chartex" xmlns:cx8="http://schemas.microsoft.com/office/drawing/2016/5/14/chartex" xmlns:mc="http://schemas.openxmlformats.org/markup-compatibility/2006" xmlns:aink="http://schemas.microsoft.com/office/drawing/2016/ink" xmlns:am3d="http://schemas.microsoft.com/office/drawing/2017/model3d" xmlns:o="urn:schemas-microsoft-com:office:office" xmlns:oel="http://schemas.microsoft.com/office/2019/extlst" xmlns:r="http://schemas.openxmlformats.org/officeDocument/2006/relationships" xmlns:m="http://schemas.openxmlformats.org/officeDocument/2006/math" xmlns:v="urn:schemas-microsoft-com:vml" xmlns:wp14="http://schemas.microsoft.com/office/word/2010/wordprocessingDrawing" xmlns:wp="http://schemas.openxmlformats.org/drawingml/2006/wordprocessingDrawing" xmlns:w10="urn:schemas-microsoft-com:office:word" xmlns:w="http://schemas.openxmlformats.org/wordprocessingml/2006/main" xmlns:w14="http://schemas.microsoft.com/office/word/2010/wordml" xmlns:w15="http://schemas.microsoft.com/office/word/2012/wordml" xmlns:w16cei="http://schemas.microsoft.com/office/word/2026/wordml/cei" xmlns:w16cex="http://schemas.microsoft.com/office/word/2018/wordml/cex" xmlns:w16cid="http://schemas.microsoft.com/office/word/2016/wordml/cid" xmlns:w16="http://schemas.microsoft.com/office/word/2018/wordml" xmlns:w16du="http://schemas.microsoft.com/office/word/2023/wordml/word16du" xmlns:w16sdtdh="http://schemas.microsoft.com/office/word/2020/wordml/sdtdatahash" xmlns:w16sdtfl="http://schemas.microsoft.com/office/word/2024/wordml/sdtformatlock" xmlns:w16se="http://schemas.microsoft.com/office/word/2015/wordml/symex" xmlns:wpg="http://schemas.microsoft.com/office/word/2010/wordprocessingGroup" xmlns:wpi="http://schemas.microsoft.com/office/word/2010/wordprocessingInk" xmlns:wne="http://schemas.microsoft.com/office/word/2006/wordml" xmlns:wps="http://schemas.microsoft.com/office/word/2010/wordprocessingShape" mc:Ignorable="w14 w15 w16se w16cid w16 w16cex w16sdtdh w16sdtfl w16du wp14">
   <w:sdt>
     <w:sdtPr>
@@ -2523,12 +2592,11 @@
 </w:ftr>
 </file>
 
-<file path=word/footer2.xml><?xml version="1.0" encoding="utf-8"?>
+<file path=word/footer3.xml><?xml version="1.0" encoding="utf-8"?>
 <w:ftr xmlns:wpc="http://schemas.microsoft.com/office/word/2010/wordprocessingCanvas" xmlns:cx="http://schemas.microsoft.com/office/drawing/2014/chartex" xmlns:cx1="http://schemas.microsoft.com/office/drawing/2015/9/8/chartex" xmlns:cx2="http://schemas.microsoft.com/office/drawing/2015/10/21/chartex" xmlns:cx3="http://schemas.microsoft.com/office/drawing/2016/5/9/chartex" xmlns:cx4="http://schemas.microsoft.com/office/drawing/2016/5/10/chartex" xmlns:cx5="http://schemas.microsoft.com/office/drawing/2016/5/11/chartex" xmlns:cx6="http://schemas.microsoft.com/office/drawing/2016/5/12/chartex" xmlns:cx7="http://schemas.microsoft.com/office/drawing/2016/5/13/chartex" xmlns:cx8="http://schemas.microsoft.com/office/drawing/2016/5/14/chartex" xmlns:mc="http://schemas.openxmlformats.org/markup-compatibility/2006" xmlns:aink="http://schemas.microsoft.com/office/drawing/2016/ink" xmlns:am3d="http://schemas.microsoft.com/office/drawing/2017/model3d" xmlns:o="urn:schemas-microsoft-com:office:office" xmlns:oel="http://schemas.microsoft.com/office/2019/extlst" xmlns:r="http://schemas.openxmlformats.org/officeDocument/2006/relationships" xmlns:m="http://schemas.openxmlformats.org/officeDocument/2006/math" xmlns:v="urn:schemas-microsoft-com:vml" xmlns:wp14="http://schemas.microsoft.com/office/word/2010/wordprocessingDrawing" xmlns:wp="http://schemas.openxmlformats.org/drawingml/2006/wordprocessingDrawing" xmlns:w10="urn:schemas-microsoft-com:office:word" xmlns:w="http://schemas.openxmlformats.org/wordprocessingml/2006/main" xmlns:w14="http://schemas.microsoft.com/office/word/2010/wordml" xmlns:w15="http://schemas.microsoft.com/office/word/2012/wordml" xmlns:w16cei="http://schemas.microsoft.com/office/word/2026/wordml/cei" xmlns:w16cex="http://schemas.microsoft.com/office/word/2018/wordml/cex" xmlns:w16cid="http://schemas.microsoft.com/office/word/2016/wordml/cid" xmlns:w16="http://schemas.microsoft.com/office/word/2018/wordml" xmlns:w16du="http://schemas.microsoft.com/office/word/2023/wordml/word16du" xmlns:w16sdtdh="http://schemas.microsoft.com/office/word/2020/wordml/sdtdatahash" xmlns:w16sdtfl="http://schemas.microsoft.com/office/word/2024/wordml/sdtformatlock" xmlns:w16se="http://schemas.microsoft.com/office/word/2015/wordml/symex" xmlns:wpg="http://schemas.microsoft.com/office/word/2010/wordprocessingGroup" xmlns:wpi="http://schemas.microsoft.com/office/word/2010/wordprocessingInk" xmlns:wne="http://schemas.microsoft.com/office/word/2006/wordml" xmlns:wps="http://schemas.microsoft.com/office/word/2010/wordprocessingShape" mc:Ignorable="w14 w15 w16se w16cid w16 w16cex w16sdtdh w16sdtfl w16du wp14">
   <w:p>
     <w:pPr>
-      <w:pStyle w:val="Footer"/>
-      <w:jc w:val="center"/>
+      <w:pStyle w:val="Subtitle"/>
       <w:rPr>
         <w:lang w:val="hu-HU"/>
       </w:rPr>
@@ -2569,6 +2637,36 @@
     </w:p>
   </w:footnote>
 </w:footnotes>
+</file>
+
+<file path=word/header1.xml><?xml version="1.0" encoding="utf-8"?>
+<w:hdr xmlns:wpc="http://schemas.microsoft.com/office/word/2010/wordprocessingCanvas" xmlns:cx="http://schemas.microsoft.com/office/drawing/2014/chartex" xmlns:cx1="http://schemas.microsoft.com/office/drawing/2015/9/8/chartex" xmlns:cx2="http://schemas.microsoft.com/office/drawing/2015/10/21/chartex" xmlns:cx3="http://schemas.microsoft.com/office/drawing/2016/5/9/chartex" xmlns:cx4="http://schemas.microsoft.com/office/drawing/2016/5/10/chartex" xmlns:cx5="http://schemas.microsoft.com/office/drawing/2016/5/11/chartex" xmlns:cx6="http://schemas.microsoft.com/office/drawing/2016/5/12/chartex" xmlns:cx7="http://schemas.microsoft.com/office/drawing/2016/5/13/chartex" xmlns:cx8="http://schemas.microsoft.com/office/drawing/2016/5/14/chartex" xmlns:mc="http://schemas.openxmlformats.org/markup-compatibility/2006" xmlns:aink="http://schemas.microsoft.com/office/drawing/2016/ink" xmlns:am3d="http://schemas.microsoft.com/office/drawing/2017/model3d" xmlns:o="urn:schemas-microsoft-com:office:office" xmlns:oel="http://schemas.microsoft.com/office/2019/extlst" xmlns:r="http://schemas.openxmlformats.org/officeDocument/2006/relationships" xmlns:m="http://schemas.openxmlformats.org/officeDocument/2006/math" xmlns:v="urn:schemas-microsoft-com:vml" xmlns:wp14="http://schemas.microsoft.com/office/word/2010/wordprocessingDrawing" xmlns:wp="http://schemas.openxmlformats.org/drawingml/2006/wordprocessingDrawing" xmlns:w10="urn:schemas-microsoft-com:office:word" xmlns:w="http://schemas.openxmlformats.org/wordprocessingml/2006/main" xmlns:w14="http://schemas.microsoft.com/office/word/2010/wordml" xmlns:w15="http://schemas.microsoft.com/office/word/2012/wordml" xmlns:w16cei="http://schemas.microsoft.com/office/word/2026/wordml/cei" xmlns:w16cex="http://schemas.microsoft.com/office/word/2018/wordml/cex" xmlns:w16cid="http://schemas.microsoft.com/office/word/2016/wordml/cid" xmlns:w16="http://schemas.microsoft.com/office/word/2018/wordml" xmlns:w16du="http://schemas.microsoft.com/office/word/2023/wordml/word16du" xmlns:w16sdtdh="http://schemas.microsoft.com/office/word/2020/wordml/sdtdatahash" xmlns:w16sdtfl="http://schemas.microsoft.com/office/word/2024/wordml/sdtformatlock" xmlns:w16se="http://schemas.microsoft.com/office/word/2015/wordml/symex" xmlns:wpg="http://schemas.microsoft.com/office/word/2010/wordprocessingGroup" xmlns:wpi="http://schemas.microsoft.com/office/word/2010/wordprocessingInk" xmlns:wne="http://schemas.microsoft.com/office/word/2006/wordml" xmlns:wps="http://schemas.microsoft.com/office/word/2010/wordprocessingShape" mc:Ignorable="w14 w15 w16se w16cid w16 w16cex w16sdtdh w16sdtfl w16du wp14">
+  <w:p>
+    <w:pPr>
+      <w:pStyle w:val="Header"/>
+    </w:pPr>
+  </w:p>
+</w:hdr>
+</file>
+
+<file path=word/header2.xml><?xml version="1.0" encoding="utf-8"?>
+<w:hdr xmlns:wpc="http://schemas.microsoft.com/office/word/2010/wordprocessingCanvas" xmlns:cx="http://schemas.microsoft.com/office/drawing/2014/chartex" xmlns:cx1="http://schemas.microsoft.com/office/drawing/2015/9/8/chartex" xmlns:cx2="http://schemas.microsoft.com/office/drawing/2015/10/21/chartex" xmlns:cx3="http://schemas.microsoft.com/office/drawing/2016/5/9/chartex" xmlns:cx4="http://schemas.microsoft.com/office/drawing/2016/5/10/chartex" xmlns:cx5="http://schemas.microsoft.com/office/drawing/2016/5/11/chartex" xmlns:cx6="http://schemas.microsoft.com/office/drawing/2016/5/12/chartex" xmlns:cx7="http://schemas.microsoft.com/office/drawing/2016/5/13/chartex" xmlns:cx8="http://schemas.microsoft.com/office/drawing/2016/5/14/chartex" xmlns:mc="http://schemas.openxmlformats.org/markup-compatibility/2006" xmlns:aink="http://schemas.microsoft.com/office/drawing/2016/ink" xmlns:am3d="http://schemas.microsoft.com/office/drawing/2017/model3d" xmlns:o="urn:schemas-microsoft-com:office:office" xmlns:oel="http://schemas.microsoft.com/office/2019/extlst" xmlns:r="http://schemas.openxmlformats.org/officeDocument/2006/relationships" xmlns:m="http://schemas.openxmlformats.org/officeDocument/2006/math" xmlns:v="urn:schemas-microsoft-com:vml" xmlns:wp14="http://schemas.microsoft.com/office/word/2010/wordprocessingDrawing" xmlns:wp="http://schemas.openxmlformats.org/drawingml/2006/wordprocessingDrawing" xmlns:w10="urn:schemas-microsoft-com:office:word" xmlns:w="http://schemas.openxmlformats.org/wordprocessingml/2006/main" xmlns:w14="http://schemas.microsoft.com/office/word/2010/wordml" xmlns:w15="http://schemas.microsoft.com/office/word/2012/wordml" xmlns:w16cei="http://schemas.microsoft.com/office/word/2026/wordml/cei" xmlns:w16cex="http://schemas.microsoft.com/office/word/2018/wordml/cex" xmlns:w16cid="http://schemas.microsoft.com/office/word/2016/wordml/cid" xmlns:w16="http://schemas.microsoft.com/office/word/2018/wordml" xmlns:w16du="http://schemas.microsoft.com/office/word/2023/wordml/word16du" xmlns:w16sdtdh="http://schemas.microsoft.com/office/word/2020/wordml/sdtdatahash" xmlns:w16sdtfl="http://schemas.microsoft.com/office/word/2024/wordml/sdtformatlock" xmlns:w16se="http://schemas.microsoft.com/office/word/2015/wordml/symex" xmlns:wpg="http://schemas.microsoft.com/office/word/2010/wordprocessingGroup" xmlns:wpi="http://schemas.microsoft.com/office/word/2010/wordprocessingInk" xmlns:wne="http://schemas.microsoft.com/office/word/2006/wordml" xmlns:wps="http://schemas.microsoft.com/office/word/2010/wordprocessingShape" mc:Ignorable="w14 w15 w16se w16cid w16 w16cex w16sdtdh w16sdtfl w16du wp14">
+  <w:p>
+    <w:pPr>
+      <w:pStyle w:val="Header"/>
+    </w:pPr>
+  </w:p>
+</w:hdr>
+</file>
+
+<file path=word/header3.xml><?xml version="1.0" encoding="utf-8"?>
+<w:hdr xmlns:wpc="http://schemas.microsoft.com/office/word/2010/wordprocessingCanvas" xmlns:cx="http://schemas.microsoft.com/office/drawing/2014/chartex" xmlns:cx1="http://schemas.microsoft.com/office/drawing/2015/9/8/chartex" xmlns:cx2="http://schemas.microsoft.com/office/drawing/2015/10/21/chartex" xmlns:cx3="http://schemas.microsoft.com/office/drawing/2016/5/9/chartex" xmlns:cx4="http://schemas.microsoft.com/office/drawing/2016/5/10/chartex" xmlns:cx5="http://schemas.microsoft.com/office/drawing/2016/5/11/chartex" xmlns:cx6="http://schemas.microsoft.com/office/drawing/2016/5/12/chartex" xmlns:cx7="http://schemas.microsoft.com/office/drawing/2016/5/13/chartex" xmlns:cx8="http://schemas.microsoft.com/office/drawing/2016/5/14/chartex" xmlns:mc="http://schemas.openxmlformats.org/markup-compatibility/2006" xmlns:aink="http://schemas.microsoft.com/office/drawing/2016/ink" xmlns:am3d="http://schemas.microsoft.com/office/drawing/2017/model3d" xmlns:o="urn:schemas-microsoft-com:office:office" xmlns:oel="http://schemas.microsoft.com/office/2019/extlst" xmlns:r="http://schemas.openxmlformats.org/officeDocument/2006/relationships" xmlns:m="http://schemas.openxmlformats.org/officeDocument/2006/math" xmlns:v="urn:schemas-microsoft-com:vml" xmlns:wp14="http://schemas.microsoft.com/office/word/2010/wordprocessingDrawing" xmlns:wp="http://schemas.openxmlformats.org/drawingml/2006/wordprocessingDrawing" xmlns:w10="urn:schemas-microsoft-com:office:word" xmlns:w="http://schemas.openxmlformats.org/wordprocessingml/2006/main" xmlns:w14="http://schemas.microsoft.com/office/word/2010/wordml" xmlns:w15="http://schemas.microsoft.com/office/word/2012/wordml" xmlns:w16cei="http://schemas.microsoft.com/office/word/2026/wordml/cei" xmlns:w16cex="http://schemas.microsoft.com/office/word/2018/wordml/cex" xmlns:w16cid="http://schemas.microsoft.com/office/word/2016/wordml/cid" xmlns:w16="http://schemas.microsoft.com/office/word/2018/wordml" xmlns:w16du="http://schemas.microsoft.com/office/word/2023/wordml/word16du" xmlns:w16sdtdh="http://schemas.microsoft.com/office/word/2020/wordml/sdtdatahash" xmlns:w16sdtfl="http://schemas.microsoft.com/office/word/2024/wordml/sdtformatlock" xmlns:w16se="http://schemas.microsoft.com/office/word/2015/wordml/symex" xmlns:wpg="http://schemas.microsoft.com/office/word/2010/wordprocessingGroup" xmlns:wpi="http://schemas.microsoft.com/office/word/2010/wordprocessingInk" xmlns:wne="http://schemas.microsoft.com/office/word/2006/wordml" xmlns:wps="http://schemas.microsoft.com/office/word/2010/wordprocessingShape" mc:Ignorable="w14 w15 w16se w16cid w16 w16cex w16sdtdh w16sdtfl w16du wp14">
+  <w:p>
+    <w:pPr>
+      <w:pStyle w:val="Header"/>
+    </w:pPr>
+  </w:p>
+</w:hdr>
 </file>
 
 <file path=word/numbering.xml><?xml version="1.0" encoding="utf-8"?>
@@ -4616,6 +4714,7 @@
   <w:style w:type="character" w:default="1" w:styleId="DefaultParagraphFont">
     <w:name w:val="Default Paragraph Font"/>
     <w:uiPriority w:val="1"/>
+    <w:semiHidden/>
     <w:unhideWhenUsed/>
   </w:style>
   <w:style w:type="table" w:default="1" w:styleId="TableNormal">

</xml_diff>

<commit_message>
Split the Core project from the MAUI frontend, preparing for UnitTests
</commit_message>
<xml_diff>
--- a/Docs/API Leírás.docx
+++ b/Docs/API Leírás.docx
@@ -1896,7 +1896,7 @@
         <w:pStyle w:val="ListParagraph"/>
         <w:numPr>
           <w:ilvl w:val="0"/>
-          <w:numId w:val="10"/>
+          <w:numId w:val="16"/>
         </w:numPr>
       </w:pPr>
       <w:proofErr w:type="spellStart"/>
@@ -2761,6 +2761,119 @@
     </w:lvl>
   </w:abstractNum>
   <w:abstractNum w:abstractNumId="1" w15:restartNumberingAfterBreak="0">
+    <w:nsid w:val="01303712"/>
+    <w:multiLevelType w:val="hybridMultilevel"/>
+    <w:tmpl w:val="C888A5AE"/>
+    <w:lvl w:ilvl="0" w:tplc="04090001">
+      <w:start w:val="1"/>
+      <w:numFmt w:val="bullet"/>
+      <w:lvlText w:val=""/>
+      <w:lvlJc w:val="left"/>
+      <w:pPr>
+        <w:ind w:left="1080" w:hanging="360"/>
+      </w:pPr>
+      <w:rPr>
+        <w:rFonts w:ascii="Symbol" w:hAnsi="Symbol" w:hint="default"/>
+      </w:rPr>
+    </w:lvl>
+    <w:lvl w:ilvl="1" w:tplc="04090003" w:tentative="1">
+      <w:start w:val="1"/>
+      <w:numFmt w:val="bullet"/>
+      <w:lvlText w:val="o"/>
+      <w:lvlJc w:val="left"/>
+      <w:pPr>
+        <w:ind w:left="1800" w:hanging="360"/>
+      </w:pPr>
+      <w:rPr>
+        <w:rFonts w:ascii="Courier New" w:hAnsi="Courier New" w:cs="Courier New" w:hint="default"/>
+      </w:rPr>
+    </w:lvl>
+    <w:lvl w:ilvl="2" w:tplc="04090005" w:tentative="1">
+      <w:start w:val="1"/>
+      <w:numFmt w:val="bullet"/>
+      <w:lvlText w:val=""/>
+      <w:lvlJc w:val="left"/>
+      <w:pPr>
+        <w:ind w:left="2520" w:hanging="360"/>
+      </w:pPr>
+      <w:rPr>
+        <w:rFonts w:ascii="Wingdings" w:hAnsi="Wingdings" w:hint="default"/>
+      </w:rPr>
+    </w:lvl>
+    <w:lvl w:ilvl="3" w:tplc="04090001" w:tentative="1">
+      <w:start w:val="1"/>
+      <w:numFmt w:val="bullet"/>
+      <w:lvlText w:val=""/>
+      <w:lvlJc w:val="left"/>
+      <w:pPr>
+        <w:ind w:left="3240" w:hanging="360"/>
+      </w:pPr>
+      <w:rPr>
+        <w:rFonts w:ascii="Symbol" w:hAnsi="Symbol" w:hint="default"/>
+      </w:rPr>
+    </w:lvl>
+    <w:lvl w:ilvl="4" w:tplc="04090003" w:tentative="1">
+      <w:start w:val="1"/>
+      <w:numFmt w:val="bullet"/>
+      <w:lvlText w:val="o"/>
+      <w:lvlJc w:val="left"/>
+      <w:pPr>
+        <w:ind w:left="3960" w:hanging="360"/>
+      </w:pPr>
+      <w:rPr>
+        <w:rFonts w:ascii="Courier New" w:hAnsi="Courier New" w:cs="Courier New" w:hint="default"/>
+      </w:rPr>
+    </w:lvl>
+    <w:lvl w:ilvl="5" w:tplc="04090005" w:tentative="1">
+      <w:start w:val="1"/>
+      <w:numFmt w:val="bullet"/>
+      <w:lvlText w:val=""/>
+      <w:lvlJc w:val="left"/>
+      <w:pPr>
+        <w:ind w:left="4680" w:hanging="360"/>
+      </w:pPr>
+      <w:rPr>
+        <w:rFonts w:ascii="Wingdings" w:hAnsi="Wingdings" w:hint="default"/>
+      </w:rPr>
+    </w:lvl>
+    <w:lvl w:ilvl="6" w:tplc="04090001" w:tentative="1">
+      <w:start w:val="1"/>
+      <w:numFmt w:val="bullet"/>
+      <w:lvlText w:val=""/>
+      <w:lvlJc w:val="left"/>
+      <w:pPr>
+        <w:ind w:left="5400" w:hanging="360"/>
+      </w:pPr>
+      <w:rPr>
+        <w:rFonts w:ascii="Symbol" w:hAnsi="Symbol" w:hint="default"/>
+      </w:rPr>
+    </w:lvl>
+    <w:lvl w:ilvl="7" w:tplc="04090003" w:tentative="1">
+      <w:start w:val="1"/>
+      <w:numFmt w:val="bullet"/>
+      <w:lvlText w:val="o"/>
+      <w:lvlJc w:val="left"/>
+      <w:pPr>
+        <w:ind w:left="6120" w:hanging="360"/>
+      </w:pPr>
+      <w:rPr>
+        <w:rFonts w:ascii="Courier New" w:hAnsi="Courier New" w:cs="Courier New" w:hint="default"/>
+      </w:rPr>
+    </w:lvl>
+    <w:lvl w:ilvl="8" w:tplc="04090005" w:tentative="1">
+      <w:start w:val="1"/>
+      <w:numFmt w:val="bullet"/>
+      <w:lvlText w:val=""/>
+      <w:lvlJc w:val="left"/>
+      <w:pPr>
+        <w:ind w:left="6840" w:hanging="360"/>
+      </w:pPr>
+      <w:rPr>
+        <w:rFonts w:ascii="Wingdings" w:hAnsi="Wingdings" w:hint="default"/>
+      </w:rPr>
+    </w:lvl>
+  </w:abstractNum>
+  <w:abstractNum w:abstractNumId="2" w15:restartNumberingAfterBreak="0">
     <w:nsid w:val="09664F23"/>
     <w:multiLevelType w:val="hybridMultilevel"/>
     <w:tmpl w:val="95128008"/>
@@ -2873,7 +2986,7 @@
       </w:rPr>
     </w:lvl>
   </w:abstractNum>
-  <w:abstractNum w:abstractNumId="2" w15:restartNumberingAfterBreak="0">
+  <w:abstractNum w:abstractNumId="3" w15:restartNumberingAfterBreak="0">
     <w:nsid w:val="109255D4"/>
     <w:multiLevelType w:val="hybridMultilevel"/>
     <w:tmpl w:val="EB943C6A"/>
@@ -2986,7 +3099,7 @@
       </w:rPr>
     </w:lvl>
   </w:abstractNum>
-  <w:abstractNum w:abstractNumId="3" w15:restartNumberingAfterBreak="0">
+  <w:abstractNum w:abstractNumId="4" w15:restartNumberingAfterBreak="0">
     <w:nsid w:val="11BD3FCA"/>
     <w:multiLevelType w:val="hybridMultilevel"/>
     <w:tmpl w:val="A0E85498"/>
@@ -3099,7 +3212,120 @@
       </w:rPr>
     </w:lvl>
   </w:abstractNum>
-  <w:abstractNum w:abstractNumId="4" w15:restartNumberingAfterBreak="0">
+  <w:abstractNum w:abstractNumId="5" w15:restartNumberingAfterBreak="0">
+    <w:nsid w:val="1F62372C"/>
+    <w:multiLevelType w:val="hybridMultilevel"/>
+    <w:tmpl w:val="987098A4"/>
+    <w:lvl w:ilvl="0" w:tplc="04090001">
+      <w:start w:val="1"/>
+      <w:numFmt w:val="bullet"/>
+      <w:lvlText w:val=""/>
+      <w:lvlJc w:val="left"/>
+      <w:pPr>
+        <w:ind w:left="1800" w:hanging="360"/>
+      </w:pPr>
+      <w:rPr>
+        <w:rFonts w:ascii="Symbol" w:hAnsi="Symbol" w:hint="default"/>
+      </w:rPr>
+    </w:lvl>
+    <w:lvl w:ilvl="1" w:tplc="04090003" w:tentative="1">
+      <w:start w:val="1"/>
+      <w:numFmt w:val="bullet"/>
+      <w:lvlText w:val="o"/>
+      <w:lvlJc w:val="left"/>
+      <w:pPr>
+        <w:ind w:left="2520" w:hanging="360"/>
+      </w:pPr>
+      <w:rPr>
+        <w:rFonts w:ascii="Courier New" w:hAnsi="Courier New" w:cs="Courier New" w:hint="default"/>
+      </w:rPr>
+    </w:lvl>
+    <w:lvl w:ilvl="2" w:tplc="04090005" w:tentative="1">
+      <w:start w:val="1"/>
+      <w:numFmt w:val="bullet"/>
+      <w:lvlText w:val=""/>
+      <w:lvlJc w:val="left"/>
+      <w:pPr>
+        <w:ind w:left="3240" w:hanging="360"/>
+      </w:pPr>
+      <w:rPr>
+        <w:rFonts w:ascii="Wingdings" w:hAnsi="Wingdings" w:hint="default"/>
+      </w:rPr>
+    </w:lvl>
+    <w:lvl w:ilvl="3" w:tplc="04090001" w:tentative="1">
+      <w:start w:val="1"/>
+      <w:numFmt w:val="bullet"/>
+      <w:lvlText w:val=""/>
+      <w:lvlJc w:val="left"/>
+      <w:pPr>
+        <w:ind w:left="3960" w:hanging="360"/>
+      </w:pPr>
+      <w:rPr>
+        <w:rFonts w:ascii="Symbol" w:hAnsi="Symbol" w:hint="default"/>
+      </w:rPr>
+    </w:lvl>
+    <w:lvl w:ilvl="4" w:tplc="04090003" w:tentative="1">
+      <w:start w:val="1"/>
+      <w:numFmt w:val="bullet"/>
+      <w:lvlText w:val="o"/>
+      <w:lvlJc w:val="left"/>
+      <w:pPr>
+        <w:ind w:left="4680" w:hanging="360"/>
+      </w:pPr>
+      <w:rPr>
+        <w:rFonts w:ascii="Courier New" w:hAnsi="Courier New" w:cs="Courier New" w:hint="default"/>
+      </w:rPr>
+    </w:lvl>
+    <w:lvl w:ilvl="5" w:tplc="04090005" w:tentative="1">
+      <w:start w:val="1"/>
+      <w:numFmt w:val="bullet"/>
+      <w:lvlText w:val=""/>
+      <w:lvlJc w:val="left"/>
+      <w:pPr>
+        <w:ind w:left="5400" w:hanging="360"/>
+      </w:pPr>
+      <w:rPr>
+        <w:rFonts w:ascii="Wingdings" w:hAnsi="Wingdings" w:hint="default"/>
+      </w:rPr>
+    </w:lvl>
+    <w:lvl w:ilvl="6" w:tplc="04090001" w:tentative="1">
+      <w:start w:val="1"/>
+      <w:numFmt w:val="bullet"/>
+      <w:lvlText w:val=""/>
+      <w:lvlJc w:val="left"/>
+      <w:pPr>
+        <w:ind w:left="6120" w:hanging="360"/>
+      </w:pPr>
+      <w:rPr>
+        <w:rFonts w:ascii="Symbol" w:hAnsi="Symbol" w:hint="default"/>
+      </w:rPr>
+    </w:lvl>
+    <w:lvl w:ilvl="7" w:tplc="04090003" w:tentative="1">
+      <w:start w:val="1"/>
+      <w:numFmt w:val="bullet"/>
+      <w:lvlText w:val="o"/>
+      <w:lvlJc w:val="left"/>
+      <w:pPr>
+        <w:ind w:left="6840" w:hanging="360"/>
+      </w:pPr>
+      <w:rPr>
+        <w:rFonts w:ascii="Courier New" w:hAnsi="Courier New" w:cs="Courier New" w:hint="default"/>
+      </w:rPr>
+    </w:lvl>
+    <w:lvl w:ilvl="8" w:tplc="04090005" w:tentative="1">
+      <w:start w:val="1"/>
+      <w:numFmt w:val="bullet"/>
+      <w:lvlText w:val=""/>
+      <w:lvlJc w:val="left"/>
+      <w:pPr>
+        <w:ind w:left="7560" w:hanging="360"/>
+      </w:pPr>
+      <w:rPr>
+        <w:rFonts w:ascii="Wingdings" w:hAnsi="Wingdings" w:hint="default"/>
+      </w:rPr>
+    </w:lvl>
+  </w:abstractNum>
+  <w:abstractNum w:abstractNumId="6" w15:restartNumberingAfterBreak="0">
     <w:nsid w:val="2BA819E2"/>
     <w:multiLevelType w:val="hybridMultilevel"/>
     <w:tmpl w:val="BB9038F8"/>
@@ -3212,7 +3438,7 @@
       </w:rPr>
     </w:lvl>
   </w:abstractNum>
-  <w:abstractNum w:abstractNumId="5" w15:restartNumberingAfterBreak="0">
+  <w:abstractNum w:abstractNumId="7" w15:restartNumberingAfterBreak="0">
     <w:nsid w:val="2E664435"/>
     <w:multiLevelType w:val="hybridMultilevel"/>
     <w:tmpl w:val="5F908542"/>
@@ -3325,7 +3551,7 @@
       </w:rPr>
     </w:lvl>
   </w:abstractNum>
-  <w:abstractNum w:abstractNumId="6" w15:restartNumberingAfterBreak="0">
+  <w:abstractNum w:abstractNumId="8" w15:restartNumberingAfterBreak="0">
     <w:nsid w:val="3E1F6E52"/>
     <w:multiLevelType w:val="hybridMultilevel"/>
     <w:tmpl w:val="D882AAFC"/>
@@ -3438,7 +3664,7 @@
       </w:rPr>
     </w:lvl>
   </w:abstractNum>
-  <w:abstractNum w:abstractNumId="7" w15:restartNumberingAfterBreak="0">
+  <w:abstractNum w:abstractNumId="9" w15:restartNumberingAfterBreak="0">
     <w:nsid w:val="43526CA4"/>
     <w:multiLevelType w:val="hybridMultilevel"/>
     <w:tmpl w:val="C3CE4F42"/>
@@ -3527,7 +3753,7 @@
       </w:pPr>
     </w:lvl>
   </w:abstractNum>
-  <w:abstractNum w:abstractNumId="8" w15:restartNumberingAfterBreak="0">
+  <w:abstractNum w:abstractNumId="10" w15:restartNumberingAfterBreak="0">
     <w:nsid w:val="446A56AC"/>
     <w:multiLevelType w:val="hybridMultilevel"/>
     <w:tmpl w:val="80801170"/>
@@ -3640,7 +3866,7 @@
       </w:rPr>
     </w:lvl>
   </w:abstractNum>
-  <w:abstractNum w:abstractNumId="9" w15:restartNumberingAfterBreak="0">
+  <w:abstractNum w:abstractNumId="11" w15:restartNumberingAfterBreak="0">
     <w:nsid w:val="5B7C7A9A"/>
     <w:multiLevelType w:val="hybridMultilevel"/>
     <w:tmpl w:val="93360E8C"/>
@@ -3753,7 +3979,120 @@
       </w:rPr>
     </w:lvl>
   </w:abstractNum>
-  <w:abstractNum w:abstractNumId="10" w15:restartNumberingAfterBreak="0">
+  <w:abstractNum w:abstractNumId="12" w15:restartNumberingAfterBreak="0">
+    <w:nsid w:val="5B9D57B2"/>
+    <w:multiLevelType w:val="hybridMultilevel"/>
+    <w:tmpl w:val="11D8E0B8"/>
+    <w:lvl w:ilvl="0" w:tplc="04090001">
+      <w:start w:val="1"/>
+      <w:numFmt w:val="bullet"/>
+      <w:lvlText w:val=""/>
+      <w:lvlJc w:val="left"/>
+      <w:pPr>
+        <w:ind w:left="1440" w:hanging="360"/>
+      </w:pPr>
+      <w:rPr>
+        <w:rFonts w:ascii="Symbol" w:hAnsi="Symbol" w:hint="default"/>
+      </w:rPr>
+    </w:lvl>
+    <w:lvl w:ilvl="1" w:tplc="04090003" w:tentative="1">
+      <w:start w:val="1"/>
+      <w:numFmt w:val="bullet"/>
+      <w:lvlText w:val="o"/>
+      <w:lvlJc w:val="left"/>
+      <w:pPr>
+        <w:ind w:left="2160" w:hanging="360"/>
+      </w:pPr>
+      <w:rPr>
+        <w:rFonts w:ascii="Courier New" w:hAnsi="Courier New" w:cs="Courier New" w:hint="default"/>
+      </w:rPr>
+    </w:lvl>
+    <w:lvl w:ilvl="2" w:tplc="04090005" w:tentative="1">
+      <w:start w:val="1"/>
+      <w:numFmt w:val="bullet"/>
+      <w:lvlText w:val=""/>
+      <w:lvlJc w:val="left"/>
+      <w:pPr>
+        <w:ind w:left="2880" w:hanging="360"/>
+      </w:pPr>
+      <w:rPr>
+        <w:rFonts w:ascii="Wingdings" w:hAnsi="Wingdings" w:hint="default"/>
+      </w:rPr>
+    </w:lvl>
+    <w:lvl w:ilvl="3" w:tplc="04090001" w:tentative="1">
+      <w:start w:val="1"/>
+      <w:numFmt w:val="bullet"/>
+      <w:lvlText w:val=""/>
+      <w:lvlJc w:val="left"/>
+      <w:pPr>
+        <w:ind w:left="3600" w:hanging="360"/>
+      </w:pPr>
+      <w:rPr>
+        <w:rFonts w:ascii="Symbol" w:hAnsi="Symbol" w:hint="default"/>
+      </w:rPr>
+    </w:lvl>
+    <w:lvl w:ilvl="4" w:tplc="04090003" w:tentative="1">
+      <w:start w:val="1"/>
+      <w:numFmt w:val="bullet"/>
+      <w:lvlText w:val="o"/>
+      <w:lvlJc w:val="left"/>
+      <w:pPr>
+        <w:ind w:left="4320" w:hanging="360"/>
+      </w:pPr>
+      <w:rPr>
+        <w:rFonts w:ascii="Courier New" w:hAnsi="Courier New" w:cs="Courier New" w:hint="default"/>
+      </w:rPr>
+    </w:lvl>
+    <w:lvl w:ilvl="5" w:tplc="04090005" w:tentative="1">
+      <w:start w:val="1"/>
+      <w:numFmt w:val="bullet"/>
+      <w:lvlText w:val=""/>
+      <w:lvlJc w:val="left"/>
+      <w:pPr>
+        <w:ind w:left="5040" w:hanging="360"/>
+      </w:pPr>
+      <w:rPr>
+        <w:rFonts w:ascii="Wingdings" w:hAnsi="Wingdings" w:hint="default"/>
+      </w:rPr>
+    </w:lvl>
+    <w:lvl w:ilvl="6" w:tplc="04090001" w:tentative="1">
+      <w:start w:val="1"/>
+      <w:numFmt w:val="bullet"/>
+      <w:lvlText w:val=""/>
+      <w:lvlJc w:val="left"/>
+      <w:pPr>
+        <w:ind w:left="5760" w:hanging="360"/>
+      </w:pPr>
+      <w:rPr>
+        <w:rFonts w:ascii="Symbol" w:hAnsi="Symbol" w:hint="default"/>
+      </w:rPr>
+    </w:lvl>
+    <w:lvl w:ilvl="7" w:tplc="04090003" w:tentative="1">
+      <w:start w:val="1"/>
+      <w:numFmt w:val="bullet"/>
+      <w:lvlText w:val="o"/>
+      <w:lvlJc w:val="left"/>
+      <w:pPr>
+        <w:ind w:left="6480" w:hanging="360"/>
+      </w:pPr>
+      <w:rPr>
+        <w:rFonts w:ascii="Courier New" w:hAnsi="Courier New" w:cs="Courier New" w:hint="default"/>
+      </w:rPr>
+    </w:lvl>
+    <w:lvl w:ilvl="8" w:tplc="04090005" w:tentative="1">
+      <w:start w:val="1"/>
+      <w:numFmt w:val="bullet"/>
+      <w:lvlText w:val=""/>
+      <w:lvlJc w:val="left"/>
+      <w:pPr>
+        <w:ind w:left="7200" w:hanging="360"/>
+      </w:pPr>
+      <w:rPr>
+        <w:rFonts w:ascii="Wingdings" w:hAnsi="Wingdings" w:hint="default"/>
+      </w:rPr>
+    </w:lvl>
+  </w:abstractNum>
+  <w:abstractNum w:abstractNumId="13" w15:restartNumberingAfterBreak="0">
     <w:nsid w:val="656B7CD4"/>
     <w:multiLevelType w:val="hybridMultilevel"/>
     <w:tmpl w:val="3B7A460E"/>
@@ -3842,7 +4181,7 @@
       </w:pPr>
     </w:lvl>
   </w:abstractNum>
-  <w:abstractNum w:abstractNumId="11" w15:restartNumberingAfterBreak="0">
+  <w:abstractNum w:abstractNumId="14" w15:restartNumberingAfterBreak="0">
     <w:nsid w:val="6AA0388F"/>
     <w:multiLevelType w:val="hybridMultilevel"/>
     <w:tmpl w:val="2F28A1DE"/>
@@ -3955,7 +4294,7 @@
       </w:rPr>
     </w:lvl>
   </w:abstractNum>
-  <w:abstractNum w:abstractNumId="12" w15:restartNumberingAfterBreak="0">
+  <w:abstractNum w:abstractNumId="15" w15:restartNumberingAfterBreak="0">
     <w:nsid w:val="7B54266C"/>
     <w:multiLevelType w:val="hybridMultilevel"/>
     <w:tmpl w:val="7A8EFCD4"/>
@@ -4069,43 +4408,52 @@
     </w:lvl>
   </w:abstractNum>
   <w:num w:numId="1" w16cid:durableId="1864896174">
-    <w:abstractNumId w:val="7"/>
+    <w:abstractNumId w:val="9"/>
   </w:num>
   <w:num w:numId="2" w16cid:durableId="858549021">
-    <w:abstractNumId w:val="1"/>
+    <w:abstractNumId w:val="2"/>
   </w:num>
   <w:num w:numId="3" w16cid:durableId="2145535834">
-    <w:abstractNumId w:val="3"/>
+    <w:abstractNumId w:val="4"/>
   </w:num>
   <w:num w:numId="4" w16cid:durableId="1539512875">
-    <w:abstractNumId w:val="10"/>
+    <w:abstractNumId w:val="13"/>
   </w:num>
   <w:num w:numId="5" w16cid:durableId="1389114310">
     <w:abstractNumId w:val="0"/>
   </w:num>
   <w:num w:numId="6" w16cid:durableId="279840299">
+    <w:abstractNumId w:val="8"/>
+  </w:num>
+  <w:num w:numId="7" w16cid:durableId="464546197">
+    <w:abstractNumId w:val="10"/>
+  </w:num>
+  <w:num w:numId="8" w16cid:durableId="1587953955">
+    <w:abstractNumId w:val="3"/>
+  </w:num>
+  <w:num w:numId="9" w16cid:durableId="282006371">
+    <w:abstractNumId w:val="15"/>
+  </w:num>
+  <w:num w:numId="10" w16cid:durableId="302269441">
+    <w:abstractNumId w:val="7"/>
+  </w:num>
+  <w:num w:numId="11" w16cid:durableId="116340875">
+    <w:abstractNumId w:val="14"/>
+  </w:num>
+  <w:num w:numId="12" w16cid:durableId="1511986265">
+    <w:abstractNumId w:val="11"/>
+  </w:num>
+  <w:num w:numId="13" w16cid:durableId="477891128">
     <w:abstractNumId w:val="6"/>
   </w:num>
-  <w:num w:numId="7" w16cid:durableId="464546197">
-    <w:abstractNumId w:val="8"/>
-  </w:num>
-  <w:num w:numId="8" w16cid:durableId="1587953955">
-    <w:abstractNumId w:val="2"/>
-  </w:num>
-  <w:num w:numId="9" w16cid:durableId="282006371">
+  <w:num w:numId="14" w16cid:durableId="1097869816">
     <w:abstractNumId w:val="12"/>
   </w:num>
-  <w:num w:numId="10" w16cid:durableId="302269441">
+  <w:num w:numId="15" w16cid:durableId="1881431713">
     <w:abstractNumId w:val="5"/>
   </w:num>
-  <w:num w:numId="11" w16cid:durableId="116340875">
-    <w:abstractNumId w:val="11"/>
-  </w:num>
-  <w:num w:numId="12" w16cid:durableId="1511986265">
-    <w:abstractNumId w:val="9"/>
-  </w:num>
-  <w:num w:numId="13" w16cid:durableId="477891128">
-    <w:abstractNumId w:val="4"/>
+  <w:num w:numId="16" w16cid:durableId="300421991">
+    <w:abstractNumId w:val="1"/>
   </w:num>
 </w:numbering>
 </file>

</xml_diff>

<commit_message>
ReadMe, API doc update
</commit_message>
<xml_diff>
--- a/Docs/API Leírás.docx
+++ b/Docs/API Leírás.docx
@@ -12,13 +12,8 @@
         </w:rPr>
       </w:pPr>
       <w:r>
-        <w:t xml:space="preserve">API </w:t>
-      </w:r>
-      <w:proofErr w:type="spellStart"/>
-      <w:r>
-        <w:t>Leírás</w:t>
-      </w:r>
-      <w:proofErr w:type="spellEnd"/>
+        <w:t>API Leírás</w:t>
+      </w:r>
     </w:p>
     <w:p>
       <w:pPr>
@@ -399,11 +394,12 @@
           <w:szCs w:val="28"/>
         </w:rPr>
       </w:pPr>
-      <w:proofErr w:type="spellStart"/>
+      <w:r>
+        <w:t>Parkolóhely-foglaló.Core.</w:t>
+      </w:r>
       <w:r>
         <w:t>Model.ParkingSpot</w:t>
       </w:r>
-      <w:proofErr w:type="spellEnd"/>
       <w:r>
         <w:t xml:space="preserve"> </w:t>
       </w:r>
@@ -420,97 +416,18 @@
           <w:szCs w:val="28"/>
         </w:rPr>
       </w:pPr>
-      <w:proofErr w:type="spellStart"/>
-      <w:r>
-        <w:t>Parkolóhely</w:t>
-      </w:r>
-      <w:proofErr w:type="spellEnd"/>
-      <w:r>
-        <w:t xml:space="preserve"> </w:t>
-      </w:r>
-      <w:proofErr w:type="spellStart"/>
-      <w:r>
-        <w:t>tárolására</w:t>
-      </w:r>
-      <w:proofErr w:type="spellEnd"/>
-      <w:r>
-        <w:t xml:space="preserve">. </w:t>
-      </w:r>
-      <w:proofErr w:type="spellStart"/>
-      <w:r>
-        <w:t>Eltárolja</w:t>
-      </w:r>
-      <w:proofErr w:type="spellEnd"/>
-      <w:r>
-        <w:t xml:space="preserve"> </w:t>
-      </w:r>
-      <w:proofErr w:type="spellStart"/>
-      <w:r>
-        <w:t>az</w:t>
-      </w:r>
-      <w:proofErr w:type="spellEnd"/>
-      <w:r>
-        <w:t xml:space="preserve"> Id-t (int), a Sort (int Row)</w:t>
+      <w:r>
+        <w:t>Parkolóhely tárolására. Eltárolja az Id-t (int), a Sort (int Row)</w:t>
       </w:r>
       <w:r>
         <w:t xml:space="preserve">, </w:t>
       </w:r>
-      <w:proofErr w:type="spellStart"/>
-      <w:r>
-        <w:t>az</w:t>
-      </w:r>
-      <w:proofErr w:type="spellEnd"/>
-      <w:r>
-        <w:t xml:space="preserve"> </w:t>
-      </w:r>
-      <w:proofErr w:type="spellStart"/>
-      <w:r>
-        <w:t>oszlopot</w:t>
-      </w:r>
-      <w:proofErr w:type="spellEnd"/>
-      <w:r>
-        <w:t xml:space="preserve"> (int Column)</w:t>
-      </w:r>
-      <w:r>
-        <w:t xml:space="preserve"> </w:t>
-      </w:r>
-      <w:proofErr w:type="spellStart"/>
-      <w:r>
-        <w:t>illetve</w:t>
-      </w:r>
-      <w:proofErr w:type="spellEnd"/>
-      <w:r>
-        <w:t xml:space="preserve"> </w:t>
-      </w:r>
-      <w:proofErr w:type="spellStart"/>
-      <w:r>
-        <w:t>hogy</w:t>
-      </w:r>
-      <w:proofErr w:type="spellEnd"/>
-      <w:r>
-        <w:t xml:space="preserve"> </w:t>
-      </w:r>
-      <w:proofErr w:type="spellStart"/>
-      <w:r>
-        <w:t>rendelkezik</w:t>
-      </w:r>
-      <w:proofErr w:type="spellEnd"/>
-      <w:r>
-        <w:t xml:space="preserve">-e </w:t>
-      </w:r>
-      <w:proofErr w:type="spellStart"/>
-      <w:r>
-        <w:t>elektromos</w:t>
-      </w:r>
-      <w:proofErr w:type="spellEnd"/>
-      <w:r>
-        <w:t xml:space="preserve"> </w:t>
-      </w:r>
-      <w:proofErr w:type="spellStart"/>
-      <w:r>
-        <w:t>töltővel</w:t>
-      </w:r>
-      <w:proofErr w:type="spellEnd"/>
+      <w:r>
+        <w:t>az oszlopot (int Column)</w:t>
+      </w:r>
+      <w:r>
+        <w:t xml:space="preserve"> illetve hogy rendelkezik-e elektromos töltővel</w:t>
+      </w:r>
       <w:r>
         <w:t>.</w:t>
       </w:r>
@@ -523,89 +440,20 @@
           <w:numId w:val="6"/>
         </w:numPr>
       </w:pPr>
-      <w:proofErr w:type="spellStart"/>
-      <w:r>
-        <w:t>Lekérhető</w:t>
-      </w:r>
-      <w:proofErr w:type="spellEnd"/>
-      <w:r>
-        <w:t xml:space="preserve"> </w:t>
-      </w:r>
-      <w:proofErr w:type="spellStart"/>
-      <w:r>
-        <w:t>ezen</w:t>
-      </w:r>
-      <w:proofErr w:type="spellEnd"/>
-      <w:r>
-        <w:t xml:space="preserve"> </w:t>
-      </w:r>
-      <w:proofErr w:type="spellStart"/>
-      <w:r>
-        <w:t>felül</w:t>
-      </w:r>
-      <w:proofErr w:type="spellEnd"/>
-      <w:r>
-        <w:t xml:space="preserve"> a Neve (string Name), </w:t>
-      </w:r>
-      <w:proofErr w:type="spellStart"/>
-      <w:r>
-        <w:t>ami</w:t>
-      </w:r>
-      <w:proofErr w:type="spellEnd"/>
-      <w:r>
-        <w:t xml:space="preserve"> </w:t>
+      <w:r>
+        <w:t xml:space="preserve">Lekérhető ezen felül a Neve (string Name), ami </w:t>
       </w:r>
       <w:r>
         <w:t>$"Spot {Id}</w:t>
       </w:r>
       <w:r>
-        <w:t xml:space="preserve"> {(</w:t>
-      </w:r>
-      <w:proofErr w:type="gramStart"/>
-      <w:r>
-        <w:t>Electric ?</w:t>
-      </w:r>
-      <w:proofErr w:type="gramEnd"/>
-      <w:r>
-        <w:t xml:space="preserve"> “- Electric</w:t>
-      </w:r>
-      <w:proofErr w:type="gramStart"/>
-      <w:r>
-        <w:t>” :</w:t>
-      </w:r>
-      <w:proofErr w:type="gramEnd"/>
-      <w:r>
-        <w:t xml:space="preserve"> “”)}</w:t>
+        <w:t xml:space="preserve"> {(Electric ? “- Electric” : “”)}</w:t>
       </w:r>
       <w:r>
         <w:t>"</w:t>
       </w:r>
       <w:r>
-        <w:t xml:space="preserve">, </w:t>
-      </w:r>
-      <w:proofErr w:type="spellStart"/>
-      <w:r>
-        <w:t>illetve</w:t>
-      </w:r>
-      <w:proofErr w:type="spellEnd"/>
-      <w:r>
-        <w:t xml:space="preserve"> a </w:t>
-      </w:r>
-      <w:proofErr w:type="spellStart"/>
-      <w:r>
-        <w:t>helye</w:t>
-      </w:r>
-      <w:proofErr w:type="spellEnd"/>
-      <w:r>
-        <w:t xml:space="preserve"> (string Location), </w:t>
-      </w:r>
-      <w:proofErr w:type="spellStart"/>
-      <w:r>
-        <w:t>ami</w:t>
-      </w:r>
-      <w:proofErr w:type="spellEnd"/>
-      <w:r>
-        <w:t xml:space="preserve"> </w:t>
+        <w:t xml:space="preserve">, illetve a helye (string Location), ami </w:t>
       </w:r>
       <w:r>
         <w:t>$"Row {Row}, Column {Column}"</w:t>
@@ -623,11 +471,12 @@
           <w:szCs w:val="28"/>
         </w:rPr>
       </w:pPr>
-      <w:proofErr w:type="spellStart"/>
+      <w:r>
+        <w:t>Parkolóhely-foglaló.Core.</w:t>
+      </w:r>
       <w:r>
         <w:t>Model.ParkingSpotReservation</w:t>
       </w:r>
-      <w:proofErr w:type="spellEnd"/>
     </w:p>
     <w:p>
       <w:pPr>
@@ -641,29 +490,8 @@
           <w:szCs w:val="28"/>
         </w:rPr>
       </w:pPr>
-      <w:proofErr w:type="spellStart"/>
-      <w:r>
-        <w:t>Parkolóhely</w:t>
-      </w:r>
-      <w:proofErr w:type="spellEnd"/>
-      <w:r>
-        <w:t xml:space="preserve"> </w:t>
-      </w:r>
-      <w:proofErr w:type="spellStart"/>
-      <w:r>
-        <w:t>foglalás</w:t>
-      </w:r>
-      <w:proofErr w:type="spellEnd"/>
-      <w:r>
-        <w:t xml:space="preserve"> </w:t>
-      </w:r>
-      <w:proofErr w:type="spellStart"/>
-      <w:r>
-        <w:t>tárolására</w:t>
-      </w:r>
-      <w:proofErr w:type="spellEnd"/>
-      <w:r>
-        <w:t xml:space="preserve">. </w:t>
+      <w:r>
+        <w:t xml:space="preserve">Parkolóhely foglalás tárolására. </w:t>
       </w:r>
     </w:p>
     <w:p>
@@ -678,127 +506,8 @@
           <w:szCs w:val="28"/>
         </w:rPr>
       </w:pPr>
-      <w:proofErr w:type="spellStart"/>
-      <w:r>
-        <w:t>Eltárolja</w:t>
-      </w:r>
-      <w:proofErr w:type="spellEnd"/>
-      <w:r>
-        <w:t xml:space="preserve"> </w:t>
-      </w:r>
-      <w:proofErr w:type="spellStart"/>
-      <w:r>
-        <w:t>az</w:t>
-      </w:r>
-      <w:proofErr w:type="spellEnd"/>
-      <w:r>
-        <w:t xml:space="preserve"> Id-t (int), a </w:t>
-      </w:r>
-      <w:proofErr w:type="spellStart"/>
-      <w:r>
-        <w:t>Parkolóhely</w:t>
-      </w:r>
-      <w:proofErr w:type="spellEnd"/>
-      <w:r>
-        <w:t xml:space="preserve"> Id-t (int </w:t>
-      </w:r>
-      <w:proofErr w:type="spellStart"/>
-      <w:r>
-        <w:t>ParkingSpotId</w:t>
-      </w:r>
-      <w:proofErr w:type="spellEnd"/>
-      <w:r>
-        <w:t xml:space="preserve">), a </w:t>
-      </w:r>
-      <w:proofErr w:type="spellStart"/>
-      <w:r>
-        <w:t>Kezdeti</w:t>
-      </w:r>
-      <w:proofErr w:type="spellEnd"/>
-      <w:r>
-        <w:t xml:space="preserve"> (</w:t>
-      </w:r>
-      <w:proofErr w:type="spellStart"/>
-      <w:r>
-        <w:t>DateTime</w:t>
-      </w:r>
-      <w:proofErr w:type="spellEnd"/>
-      <w:r>
-        <w:t xml:space="preserve"> </w:t>
-      </w:r>
-      <w:proofErr w:type="spellStart"/>
-      <w:r>
-        <w:t>StartingTime</w:t>
-      </w:r>
-      <w:proofErr w:type="spellEnd"/>
-      <w:r>
-        <w:t xml:space="preserve">) </w:t>
-      </w:r>
-      <w:proofErr w:type="spellStart"/>
-      <w:r>
-        <w:t>és</w:t>
-      </w:r>
-      <w:proofErr w:type="spellEnd"/>
-      <w:r>
-        <w:t xml:space="preserve"> a </w:t>
-      </w:r>
-      <w:proofErr w:type="spellStart"/>
-      <w:r>
-        <w:t>Befejezési</w:t>
-      </w:r>
-      <w:proofErr w:type="spellEnd"/>
-      <w:r>
-        <w:t xml:space="preserve"> </w:t>
-      </w:r>
-      <w:proofErr w:type="spellStart"/>
-      <w:r>
-        <w:t>Időt</w:t>
-      </w:r>
-      <w:proofErr w:type="spellEnd"/>
-      <w:r>
-        <w:t xml:space="preserve"> (</w:t>
-      </w:r>
-      <w:proofErr w:type="spellStart"/>
-      <w:proofErr w:type="gramStart"/>
-      <w:r>
-        <w:t>DateTime</w:t>
-      </w:r>
-      <w:proofErr w:type="spellEnd"/>
-      <w:r>
-        <w:t xml:space="preserve">  </w:t>
-      </w:r>
-      <w:proofErr w:type="spellStart"/>
-      <w:r>
-        <w:t>EndingTime</w:t>
-      </w:r>
-      <w:proofErr w:type="spellEnd"/>
-      <w:proofErr w:type="gramEnd"/>
-      <w:r>
-        <w:t xml:space="preserve">), </w:t>
-      </w:r>
-      <w:proofErr w:type="spellStart"/>
-      <w:r>
-        <w:t>illetve</w:t>
-      </w:r>
-      <w:proofErr w:type="spellEnd"/>
-      <w:r>
-        <w:t xml:space="preserve"> a </w:t>
-      </w:r>
-      <w:proofErr w:type="spellStart"/>
-      <w:r>
-        <w:t>foglalót</w:t>
-      </w:r>
-      <w:proofErr w:type="spellEnd"/>
-      <w:r>
-        <w:t xml:space="preserve"> (string </w:t>
-      </w:r>
-      <w:proofErr w:type="spellStart"/>
-      <w:r>
-        <w:t>ReservedBy</w:t>
-      </w:r>
-      <w:proofErr w:type="spellEnd"/>
-      <w:r>
-        <w:t>)</w:t>
+      <w:r>
+        <w:t>Eltárolja az Id-t (int), a Parkolóhely Id-t (int ParkingSpotId), a Kezdeti (DateTime StartingTime) és a Befejezési Időt (DateTime  EndingTime), illetve a foglalót (string ReservedBy)</w:t>
       </w:r>
     </w:p>
     <w:p>
@@ -810,12 +519,10 @@
         </w:numPr>
       </w:pPr>
       <w:bookmarkStart w:id="1" w:name="_Toc236846140"/>
-      <w:proofErr w:type="spellStart"/>
       <w:r>
         <w:t>Adatbázis</w:t>
       </w:r>
       <w:bookmarkEnd w:id="1"/>
-      <w:proofErr w:type="spellEnd"/>
     </w:p>
     <w:p>
       <w:pPr>
@@ -825,13 +532,18 @@
           <w:numId w:val="9"/>
         </w:numPr>
       </w:pPr>
-      <w:proofErr w:type="spellStart"/>
-      <w:proofErr w:type="gramStart"/>
-      <w:r>
-        <w:t>DB.DbContext</w:t>
-      </w:r>
-      <w:proofErr w:type="spellEnd"/>
-      <w:proofErr w:type="gramEnd"/>
+      <w:r>
+        <w:t>Parkolóhely-foglaló.Core.</w:t>
+      </w:r>
+      <w:r>
+        <w:t>DB.</w:t>
+      </w:r>
+      <w:r>
+        <w:t>Parking</w:t>
+      </w:r>
+      <w:r>
+        <w:t>DbContext</w:t>
+      </w:r>
     </w:p>
     <w:p>
       <w:pPr>
@@ -842,21 +554,8 @@
         </w:numPr>
       </w:pPr>
       <w:r>
-        <w:t xml:space="preserve">Maga </w:t>
-      </w:r>
-      <w:proofErr w:type="spellStart"/>
-      <w:r>
-        <w:t>az</w:t>
-      </w:r>
-      <w:proofErr w:type="spellEnd"/>
-      <w:r>
-        <w:t xml:space="preserve"> </w:t>
-      </w:r>
-      <w:proofErr w:type="spellStart"/>
-      <w:r>
-        <w:t>adatb</w:t>
-      </w:r>
-      <w:proofErr w:type="spellEnd"/>
+        <w:t>Maga az adatb</w:t>
+      </w:r>
       <w:r>
         <w:rPr>
           <w:lang w:val="hu-HU"/>
@@ -879,47 +578,7 @@
         <w:t>Van benne egy Tábla/Set a parkolóhelyekről (DbSet</w:t>
       </w:r>
       <w:r>
-        <w:t>&lt;</w:t>
-      </w:r>
-      <w:proofErr w:type="spellStart"/>
-      <w:r>
-        <w:t>ParkingSpot</w:t>
-      </w:r>
-      <w:proofErr w:type="spellEnd"/>
-      <w:r>
-        <w:t xml:space="preserve">&gt; Spots) </w:t>
-      </w:r>
-      <w:proofErr w:type="spellStart"/>
-      <w:r>
-        <w:t>illetve</w:t>
-      </w:r>
-      <w:proofErr w:type="spellEnd"/>
-      <w:r>
-        <w:t xml:space="preserve"> a </w:t>
-      </w:r>
-      <w:proofErr w:type="spellStart"/>
-      <w:r>
-        <w:t>foglalásokról</w:t>
-      </w:r>
-      <w:proofErr w:type="spellEnd"/>
-      <w:r>
-        <w:t xml:space="preserve"> (</w:t>
-      </w:r>
-      <w:proofErr w:type="spellStart"/>
-      <w:r>
-        <w:t>DbSet</w:t>
-      </w:r>
-      <w:proofErr w:type="spellEnd"/>
-      <w:r>
-        <w:t>&lt;</w:t>
-      </w:r>
-      <w:proofErr w:type="spellStart"/>
-      <w:r>
-        <w:t>ParkingSpotReservation</w:t>
-      </w:r>
-      <w:proofErr w:type="spellEnd"/>
-      <w:r>
-        <w:t>&gt; Reservations)</w:t>
+        <w:t>&lt;ParkingSpot&gt; Spots) illetve a foglalásokról (DbSet&lt;ParkingSpotReservation&gt; Reservations)</w:t>
       </w:r>
     </w:p>
     <w:p>
@@ -931,58 +590,49 @@
         </w:numPr>
       </w:pPr>
       <w:r>
-        <w:t xml:space="preserve">Ha </w:t>
-      </w:r>
-      <w:proofErr w:type="spellStart"/>
-      <w:r>
-        <w:t>akármelyik</w:t>
-      </w:r>
-      <w:proofErr w:type="spellEnd"/>
-      <w:r>
-        <w:t xml:space="preserve"> </w:t>
-      </w:r>
-      <w:proofErr w:type="spellStart"/>
-      <w:r>
-        <w:t>tábla</w:t>
-      </w:r>
-      <w:proofErr w:type="spellEnd"/>
-      <w:r>
-        <w:t xml:space="preserve"> is </w:t>
-      </w:r>
-      <w:proofErr w:type="spellStart"/>
-      <w:r>
-        <w:t>üres</w:t>
-      </w:r>
-      <w:proofErr w:type="spellEnd"/>
-      <w:r>
-        <w:t xml:space="preserve">, </w:t>
-      </w:r>
-      <w:proofErr w:type="spellStart"/>
-      <w:r>
-        <w:t>akkor</w:t>
-      </w:r>
-      <w:proofErr w:type="spellEnd"/>
-      <w:r>
-        <w:t xml:space="preserve"> abba </w:t>
-      </w:r>
-      <w:proofErr w:type="spellStart"/>
-      <w:r>
-        <w:t>belerak</w:t>
-      </w:r>
-      <w:proofErr w:type="spellEnd"/>
-      <w:r>
-        <w:t xml:space="preserve"> 6 </w:t>
-      </w:r>
-      <w:proofErr w:type="spellStart"/>
-      <w:r>
-        <w:t>Parkol</w:t>
-      </w:r>
-      <w:proofErr w:type="spellEnd"/>
+        <w:t xml:space="preserve">Ha akármelyik tábla is üres, akkor abba belerak </w:t>
+      </w:r>
+      <w:r>
+        <w:t>9</w:t>
+      </w:r>
+      <w:r>
+        <w:t xml:space="preserve"> Parkol</w:t>
+      </w:r>
       <w:r>
         <w:rPr>
           <w:lang w:val="hu-HU"/>
         </w:rPr>
-        <w:t>óhelyet, illetve 4 foglalást</w:t>
+        <w:t>óhelyet</w:t>
+      </w:r>
+      <w:r>
+        <w:rPr>
+          <w:lang w:val="hu-HU"/>
+        </w:rPr>
+        <w:t xml:space="preserve"> (6 normal, 3 electric)</w:t>
+      </w:r>
+      <w:r>
+        <w:rPr>
+          <w:lang w:val="hu-HU"/>
+        </w:rPr>
+        <w:t xml:space="preserve">, illetve </w:t>
+      </w:r>
+      <w:r>
+        <w:rPr>
+          <w:lang w:val="hu-HU"/>
+        </w:rPr>
+        <w:t>5</w:t>
+      </w:r>
+      <w:r>
+        <w:rPr>
+          <w:lang w:val="hu-HU"/>
+        </w:rPr>
+        <w:t xml:space="preserve"> foglalást</w:t>
+      </w:r>
+      <w:r>
+        <w:rPr>
+          <w:lang w:val="hu-HU"/>
+        </w:rPr>
+        <w:t xml:space="preserve"> (4 normal helyre, 1 electric helyre)</w:t>
       </w:r>
     </w:p>
     <w:p>
@@ -993,13 +643,21 @@
           <w:numId w:val="9"/>
         </w:numPr>
       </w:pPr>
-      <w:proofErr w:type="spellStart"/>
-      <w:proofErr w:type="gramStart"/>
-      <w:r>
-        <w:t>Db.DbApi</w:t>
-      </w:r>
-      <w:proofErr w:type="spellEnd"/>
-      <w:proofErr w:type="gramEnd"/>
+      <w:r>
+        <w:t>Parkolóhely-foglaló.Core.</w:t>
+      </w:r>
+      <w:r>
+        <w:t>Db.</w:t>
+      </w:r>
+      <w:r>
+        <w:t xml:space="preserve"> </w:t>
+      </w:r>
+      <w:r>
+        <w:t>Parking</w:t>
+      </w:r>
+      <w:r>
+        <w:t>DbApi</w:t>
+      </w:r>
     </w:p>
     <w:p>
       <w:pPr>
@@ -1009,45 +667,8 @@
           <w:numId w:val="9"/>
         </w:numPr>
       </w:pPr>
-      <w:proofErr w:type="spellStart"/>
-      <w:r>
-        <w:t>Adatbázis</w:t>
-      </w:r>
-      <w:proofErr w:type="spellEnd"/>
-      <w:r>
-        <w:t xml:space="preserve"> </w:t>
-      </w:r>
-      <w:proofErr w:type="spellStart"/>
-      <w:r>
-        <w:t>eléréséért</w:t>
-      </w:r>
-      <w:proofErr w:type="spellEnd"/>
-      <w:r>
-        <w:t xml:space="preserve"> </w:t>
-      </w:r>
-      <w:proofErr w:type="spellStart"/>
-      <w:r>
-        <w:t>felelős</w:t>
-      </w:r>
-      <w:proofErr w:type="spellEnd"/>
-      <w:r>
-        <w:t xml:space="preserve"> </w:t>
-      </w:r>
-      <w:proofErr w:type="spellStart"/>
-      <w:r>
-        <w:t>függvények</w:t>
-      </w:r>
-      <w:proofErr w:type="spellEnd"/>
-      <w:r>
-        <w:t xml:space="preserve"> </w:t>
-      </w:r>
-      <w:proofErr w:type="spellStart"/>
-      <w:r>
-        <w:t>összessége</w:t>
-      </w:r>
-      <w:proofErr w:type="spellEnd"/>
-      <w:r>
-        <w:t>.</w:t>
+      <w:r>
+        <w:t>Adatbázis eléréséért felelős függvények összessége.</w:t>
       </w:r>
     </w:p>
     <w:p>
@@ -1058,30 +679,20 @@
           <w:numId w:val="9"/>
         </w:numPr>
       </w:pPr>
-      <w:proofErr w:type="spellStart"/>
+      <w:r>
+        <w:t>Parking</w:t>
+      </w:r>
       <w:r>
         <w:t>DbApi.</w:t>
       </w:r>
       <w:r>
-        <w:t>GetParkingSpots</w:t>
-      </w:r>
-      <w:proofErr w:type="spellEnd"/>
-      <w:r>
-        <w:t xml:space="preserve">(): </w:t>
+        <w:t xml:space="preserve">GetParkingSpots(): </w:t>
       </w:r>
       <w:r>
         <w:t xml:space="preserve">static </w:t>
       </w:r>
       <w:r>
-        <w:t>async Task&lt;List&lt;</w:t>
-      </w:r>
-      <w:proofErr w:type="spellStart"/>
-      <w:r>
-        <w:t>ParkingSpot</w:t>
-      </w:r>
-      <w:proofErr w:type="spellEnd"/>
-      <w:r>
-        <w:t xml:space="preserve">&gt;&gt; </w:t>
+        <w:t xml:space="preserve">async Task&lt;List&lt;ParkingSpot&gt;&gt; </w:t>
       </w:r>
     </w:p>
     <w:p>
@@ -1092,21 +703,8 @@
           <w:numId w:val="9"/>
         </w:numPr>
       </w:pPr>
-      <w:proofErr w:type="spellStart"/>
-      <w:r>
-        <w:t>Visszaad</w:t>
-      </w:r>
-      <w:proofErr w:type="spellEnd"/>
-      <w:r>
-        <w:t xml:space="preserve"> </w:t>
-      </w:r>
-      <w:proofErr w:type="spellStart"/>
-      <w:r>
-        <w:t>egy</w:t>
-      </w:r>
-      <w:proofErr w:type="spellEnd"/>
-      <w:r>
-        <w:t xml:space="preserve"> list</w:t>
+      <w:r>
+        <w:t>Visszaad egy list</w:t>
       </w:r>
       <w:r>
         <w:rPr>
@@ -1123,35 +721,20 @@
           <w:numId w:val="12"/>
         </w:numPr>
       </w:pPr>
-      <w:proofErr w:type="spellStart"/>
+      <w:r>
+        <w:t>Parking</w:t>
+      </w:r>
       <w:r>
         <w:t>DbApi.</w:t>
       </w:r>
       <w:r>
-        <w:t>GetParkingSpot</w:t>
-      </w:r>
-      <w:proofErr w:type="spellEnd"/>
-      <w:r>
-        <w:t xml:space="preserve">(int id): </w:t>
-      </w:r>
-      <w:proofErr w:type="gramStart"/>
+        <w:t xml:space="preserve">GetParkingSpot(int id): </w:t>
+      </w:r>
       <w:r>
         <w:t xml:space="preserve">static  </w:t>
       </w:r>
       <w:r>
-        <w:t>async</w:t>
-      </w:r>
-      <w:proofErr w:type="gramEnd"/>
-      <w:r>
-        <w:t xml:space="preserve"> Task&lt;</w:t>
-      </w:r>
-      <w:proofErr w:type="spellStart"/>
-      <w:r>
-        <w:t>ParkingSpot</w:t>
-      </w:r>
-      <w:proofErr w:type="spellEnd"/>
-      <w:r>
-        <w:t>&gt;</w:t>
+        <w:t>async Task&lt;ParkingSpot&gt;</w:t>
       </w:r>
     </w:p>
     <w:p>
@@ -1162,43 +745,9 @@
           <w:numId w:val="9"/>
         </w:numPr>
       </w:pPr>
-      <w:proofErr w:type="spellStart"/>
-      <w:r>
-        <w:t>Visszaadja</w:t>
-      </w:r>
-      <w:proofErr w:type="spellEnd"/>
-      <w:r>
-        <w:t xml:space="preserve"> </w:t>
-      </w:r>
-      <w:proofErr w:type="spellStart"/>
-      <w:r>
-        <w:t>az</w:t>
-      </w:r>
-      <w:proofErr w:type="spellEnd"/>
-      <w:r>
-        <w:t xml:space="preserve"> id </w:t>
-      </w:r>
-      <w:proofErr w:type="spellStart"/>
-      <w:r>
-        <w:t>számú</w:t>
-      </w:r>
-      <w:proofErr w:type="spellEnd"/>
-      <w:r>
-        <w:t xml:space="preserve"> Id-</w:t>
-      </w:r>
-      <w:proofErr w:type="spellStart"/>
-      <w:r>
-        <w:t>jű</w:t>
-      </w:r>
-      <w:proofErr w:type="spellEnd"/>
-      <w:r>
-        <w:t xml:space="preserve"> </w:t>
-      </w:r>
-      <w:proofErr w:type="spellStart"/>
-      <w:r>
-        <w:t>parkolóhelyet</w:t>
-      </w:r>
-      <w:proofErr w:type="spellEnd"/>
+      <w:r>
+        <w:t>Visszaadja az id számú Id-jű parkolóhelyet</w:t>
+      </w:r>
     </w:p>
     <w:p>
       <w:pPr>
@@ -1208,53 +757,11 @@
           <w:numId w:val="12"/>
         </w:numPr>
       </w:pPr>
-      <w:proofErr w:type="spellStart"/>
-      <w:r>
-        <w:t>DbApi.GetFreeParkingSpots</w:t>
-      </w:r>
-      <w:proofErr w:type="spellEnd"/>
-      <w:r>
-        <w:t>(</w:t>
-      </w:r>
-      <w:proofErr w:type="spellStart"/>
-      <w:r>
-        <w:t>DateTime</w:t>
-      </w:r>
-      <w:proofErr w:type="spellEnd"/>
-      <w:r>
-        <w:t xml:space="preserve"> </w:t>
-      </w:r>
-      <w:proofErr w:type="spellStart"/>
-      <w:r>
-        <w:t>startingTime</w:t>
-      </w:r>
-      <w:proofErr w:type="spellEnd"/>
-      <w:r>
-        <w:t xml:space="preserve">, </w:t>
-      </w:r>
-      <w:proofErr w:type="spellStart"/>
-      <w:r>
-        <w:t>DateTime</w:t>
-      </w:r>
-      <w:proofErr w:type="spellEnd"/>
-      <w:r>
-        <w:t xml:space="preserve"> </w:t>
-      </w:r>
-      <w:proofErr w:type="spellStart"/>
-      <w:r>
-        <w:t>endingTime</w:t>
-      </w:r>
-      <w:proofErr w:type="spellEnd"/>
-      <w:r>
-        <w:t>): static async Task&lt;List&lt;</w:t>
-      </w:r>
-      <w:proofErr w:type="spellStart"/>
-      <w:r>
-        <w:t>ParkingSpot</w:t>
-      </w:r>
-      <w:proofErr w:type="spellEnd"/>
-      <w:r>
-        <w:t>&gt;&gt;</w:t>
+      <w:r>
+        <w:t>Parking</w:t>
+      </w:r>
+      <w:r>
+        <w:t>DbApi.GetFreeParkingSpots(DateTime startingTime, DateTime endingTime): static async Task&lt;List&lt;ParkingSpot&gt;&gt;</w:t>
       </w:r>
     </w:p>
     <w:p>
@@ -1265,21 +772,8 @@
           <w:numId w:val="9"/>
         </w:numPr>
       </w:pPr>
-      <w:proofErr w:type="spellStart"/>
-      <w:r>
-        <w:t>Visszaad</w:t>
-      </w:r>
-      <w:proofErr w:type="spellEnd"/>
-      <w:r>
-        <w:t xml:space="preserve"> </w:t>
-      </w:r>
-      <w:proofErr w:type="spellStart"/>
-      <w:r>
-        <w:t>egy</w:t>
-      </w:r>
-      <w:proofErr w:type="spellEnd"/>
-      <w:r>
-        <w:t xml:space="preserve"> list</w:t>
+      <w:r>
+        <w:t>Visszaad egy list</w:t>
       </w:r>
       <w:r>
         <w:rPr>
@@ -1296,53 +790,11 @@
           <w:numId w:val="9"/>
         </w:numPr>
       </w:pPr>
-      <w:proofErr w:type="spellStart"/>
-      <w:r>
-        <w:t>DbApi.GetFreeElectricParkingSpots</w:t>
-      </w:r>
-      <w:proofErr w:type="spellEnd"/>
-      <w:r>
-        <w:t>(</w:t>
-      </w:r>
-      <w:proofErr w:type="spellStart"/>
-      <w:r>
-        <w:t>DateTime</w:t>
-      </w:r>
-      <w:proofErr w:type="spellEnd"/>
-      <w:r>
-        <w:t xml:space="preserve"> </w:t>
-      </w:r>
-      <w:proofErr w:type="spellStart"/>
-      <w:r>
-        <w:t>startingTime</w:t>
-      </w:r>
-      <w:proofErr w:type="spellEnd"/>
-      <w:r>
-        <w:t xml:space="preserve">, </w:t>
-      </w:r>
-      <w:proofErr w:type="spellStart"/>
-      <w:r>
-        <w:t>DateTime</w:t>
-      </w:r>
-      <w:proofErr w:type="spellEnd"/>
-      <w:r>
-        <w:t xml:space="preserve"> </w:t>
-      </w:r>
-      <w:proofErr w:type="spellStart"/>
-      <w:r>
-        <w:t>endingTime</w:t>
-      </w:r>
-      <w:proofErr w:type="spellEnd"/>
-      <w:r>
-        <w:t>): static async Task&lt;List&lt;</w:t>
-      </w:r>
-      <w:proofErr w:type="spellStart"/>
-      <w:r>
-        <w:t>ParkingSpot</w:t>
-      </w:r>
-      <w:proofErr w:type="spellEnd"/>
-      <w:r>
-        <w:t>&gt;&gt;</w:t>
+      <w:r>
+        <w:t>Parking</w:t>
+      </w:r>
+      <w:r>
+        <w:t>DbApi.GetFreeElectricParkingSpots(DateTime startingTime, DateTime endingTime): static async Task&lt;List&lt;ParkingSpot&gt;&gt;</w:t>
       </w:r>
     </w:p>
     <w:p>
@@ -1353,21 +805,8 @@
           <w:numId w:val="9"/>
         </w:numPr>
       </w:pPr>
-      <w:proofErr w:type="spellStart"/>
-      <w:r>
-        <w:t>Visszaad</w:t>
-      </w:r>
-      <w:proofErr w:type="spellEnd"/>
-      <w:r>
-        <w:t xml:space="preserve"> </w:t>
-      </w:r>
-      <w:proofErr w:type="spellStart"/>
-      <w:r>
-        <w:t>egy</w:t>
-      </w:r>
-      <w:proofErr w:type="spellEnd"/>
-      <w:r>
-        <w:t xml:space="preserve"> list</w:t>
+      <w:r>
+        <w:t>Visszaad egy list</w:t>
       </w:r>
       <w:r>
         <w:rPr>
@@ -1396,54 +835,12 @@
           <w:numId w:val="9"/>
         </w:numPr>
       </w:pPr>
-      <w:proofErr w:type="spellStart"/>
       <w:r>
         <w:lastRenderedPageBreak/>
-        <w:t>DbApi.GetFreeNormalParkingSpots</w:t>
-      </w:r>
-      <w:proofErr w:type="spellEnd"/>
-      <w:r>
-        <w:t>(</w:t>
-      </w:r>
-      <w:proofErr w:type="spellStart"/>
-      <w:r>
-        <w:t>DateTime</w:t>
-      </w:r>
-      <w:proofErr w:type="spellEnd"/>
-      <w:r>
-        <w:t xml:space="preserve"> </w:t>
-      </w:r>
-      <w:proofErr w:type="spellStart"/>
-      <w:r>
-        <w:t>startingTime</w:t>
-      </w:r>
-      <w:proofErr w:type="spellEnd"/>
-      <w:r>
-        <w:t xml:space="preserve">, </w:t>
-      </w:r>
-      <w:proofErr w:type="spellStart"/>
-      <w:r>
-        <w:t>DateTime</w:t>
-      </w:r>
-      <w:proofErr w:type="spellEnd"/>
-      <w:r>
-        <w:t xml:space="preserve"> </w:t>
-      </w:r>
-      <w:proofErr w:type="spellStart"/>
-      <w:r>
-        <w:t>endingTime</w:t>
-      </w:r>
-      <w:proofErr w:type="spellEnd"/>
-      <w:r>
-        <w:t>): static async Task&lt;List&lt;</w:t>
-      </w:r>
-      <w:proofErr w:type="spellStart"/>
-      <w:r>
-        <w:t>ParkingSpot</w:t>
-      </w:r>
-      <w:proofErr w:type="spellEnd"/>
-      <w:r>
-        <w:t>&gt;&gt;</w:t>
+        <w:t>Parking</w:t>
+      </w:r>
+      <w:r>
+        <w:t>DbApi.GetFreeNormalParkingSpots(DateTime startingTime, DateTime endingTime): static async Task&lt;List&lt;ParkingSpot&gt;&gt;</w:t>
       </w:r>
     </w:p>
     <w:p>
@@ -1454,21 +851,8 @@
           <w:numId w:val="9"/>
         </w:numPr>
       </w:pPr>
-      <w:proofErr w:type="spellStart"/>
-      <w:r>
-        <w:t>Visszaad</w:t>
-      </w:r>
-      <w:proofErr w:type="spellEnd"/>
-      <w:r>
-        <w:t xml:space="preserve"> </w:t>
-      </w:r>
-      <w:proofErr w:type="spellStart"/>
-      <w:r>
-        <w:t>egy</w:t>
-      </w:r>
-      <w:proofErr w:type="spellEnd"/>
-      <w:r>
-        <w:t xml:space="preserve"> list</w:t>
+      <w:r>
+        <w:t>Visszaad egy list</w:t>
       </w:r>
       <w:r>
         <w:rPr>
@@ -1497,24 +881,17 @@
           <w:numId w:val="9"/>
         </w:numPr>
       </w:pPr>
-      <w:proofErr w:type="spellStart"/>
-      <w:r>
-        <w:t>DbApi.GetReservations</w:t>
-      </w:r>
-      <w:proofErr w:type="spellEnd"/>
-      <w:r>
-        <w:t>(): static async Task&lt;List&lt;</w:t>
+      <w:r>
+        <w:t>Parking</w:t>
+      </w:r>
+      <w:r>
+        <w:t>DbApi.GetReservations(): static async Task&lt;List&lt;</w:t>
       </w:r>
       <w:r>
         <w:t xml:space="preserve"> </w:t>
       </w:r>
-      <w:proofErr w:type="spellStart"/>
-      <w:r>
-        <w:t>ParkingSpotReservation</w:t>
-      </w:r>
-      <w:proofErr w:type="spellEnd"/>
-      <w:r>
-        <w:t xml:space="preserve"> &gt;&gt; </w:t>
+      <w:r>
+        <w:t xml:space="preserve">ParkingSpotReservation &gt;&gt; </w:t>
       </w:r>
     </w:p>
     <w:p>
@@ -1525,21 +902,8 @@
           <w:numId w:val="9"/>
         </w:numPr>
       </w:pPr>
-      <w:proofErr w:type="spellStart"/>
-      <w:r>
-        <w:t>Visszaad</w:t>
-      </w:r>
-      <w:proofErr w:type="spellEnd"/>
-      <w:r>
-        <w:t xml:space="preserve"> </w:t>
-      </w:r>
-      <w:proofErr w:type="spellStart"/>
-      <w:r>
-        <w:t>egy</w:t>
-      </w:r>
-      <w:proofErr w:type="spellEnd"/>
-      <w:r>
-        <w:t xml:space="preserve"> list</w:t>
+      <w:r>
+        <w:t>Visszaad egy list</w:t>
       </w:r>
       <w:r>
         <w:rPr>
@@ -1556,29 +920,11 @@
           <w:numId w:val="9"/>
         </w:numPr>
       </w:pPr>
-      <w:proofErr w:type="spellStart"/>
-      <w:r>
-        <w:t>DbApi.GetReservation</w:t>
-      </w:r>
-      <w:proofErr w:type="spellEnd"/>
-      <w:r>
-        <w:t xml:space="preserve">(int </w:t>
-      </w:r>
-      <w:proofErr w:type="spellStart"/>
-      <w:r>
-        <w:t>reservationId</w:t>
-      </w:r>
-      <w:proofErr w:type="spellEnd"/>
-      <w:r>
-        <w:t>): static async Task&lt;</w:t>
-      </w:r>
-      <w:proofErr w:type="spellStart"/>
-      <w:r>
-        <w:t>ParkingSpotReservation</w:t>
-      </w:r>
-      <w:proofErr w:type="spellEnd"/>
-      <w:r>
-        <w:t>&gt;</w:t>
+      <w:r>
+        <w:t>Parking</w:t>
+      </w:r>
+      <w:r>
+        <w:t>DbApi.GetReservation(int reservationId): static async Task&lt;ParkingSpotReservation&gt;</w:t>
       </w:r>
     </w:p>
     <w:p>
@@ -1589,43 +935,9 @@
           <w:numId w:val="9"/>
         </w:numPr>
       </w:pPr>
-      <w:proofErr w:type="spellStart"/>
-      <w:r>
-        <w:t>Visszaadja</w:t>
-      </w:r>
-      <w:proofErr w:type="spellEnd"/>
-      <w:r>
-        <w:t xml:space="preserve"> </w:t>
-      </w:r>
-      <w:proofErr w:type="spellStart"/>
-      <w:r>
-        <w:t>az</w:t>
-      </w:r>
-      <w:proofErr w:type="spellEnd"/>
-      <w:r>
-        <w:t xml:space="preserve"> </w:t>
-      </w:r>
-      <w:proofErr w:type="spellStart"/>
-      <w:r>
-        <w:t>reservationId</w:t>
-      </w:r>
-      <w:proofErr w:type="spellEnd"/>
-      <w:r>
-        <w:t xml:space="preserve"> Id-</w:t>
-      </w:r>
-      <w:proofErr w:type="spellStart"/>
-      <w:r>
-        <w:t>jű</w:t>
-      </w:r>
-      <w:proofErr w:type="spellEnd"/>
-      <w:r>
-        <w:t xml:space="preserve"> </w:t>
-      </w:r>
-      <w:proofErr w:type="spellStart"/>
-      <w:r>
-        <w:t>foglal</w:t>
-      </w:r>
-      <w:proofErr w:type="spellEnd"/>
+      <w:r>
+        <w:t>Visszaadja az reservationId Id-jű foglal</w:t>
+      </w:r>
       <w:r>
         <w:rPr>
           <w:lang w:val="hu-HU"/>
@@ -1641,29 +953,11 @@
           <w:numId w:val="9"/>
         </w:numPr>
       </w:pPr>
-      <w:proofErr w:type="spellStart"/>
-      <w:r>
-        <w:t>DbApi.GetReservationsForSpot</w:t>
-      </w:r>
-      <w:proofErr w:type="spellEnd"/>
-      <w:r>
-        <w:t>(</w:t>
-      </w:r>
-      <w:proofErr w:type="spellStart"/>
-      <w:r>
-        <w:t>ParkingSpot</w:t>
-      </w:r>
-      <w:proofErr w:type="spellEnd"/>
-      <w:r>
-        <w:t xml:space="preserve"> spot): static async Task&lt;List&lt;</w:t>
-      </w:r>
-      <w:proofErr w:type="spellStart"/>
-      <w:r>
-        <w:t>ParkingSpotReservation</w:t>
-      </w:r>
-      <w:proofErr w:type="spellEnd"/>
-      <w:r>
-        <w:t xml:space="preserve"> &gt;&gt; </w:t>
+      <w:r>
+        <w:t>Parking</w:t>
+      </w:r>
+      <w:r>
+        <w:t xml:space="preserve">DbApi.GetReservationsForSpot(ParkingSpot spot): static async Task&lt;List&lt;ParkingSpotReservation &gt;&gt; </w:t>
       </w:r>
     </w:p>
     <w:p>
@@ -1674,21 +968,8 @@
           <w:numId w:val="9"/>
         </w:numPr>
       </w:pPr>
-      <w:proofErr w:type="spellStart"/>
-      <w:r>
-        <w:t>Visszaad</w:t>
-      </w:r>
-      <w:proofErr w:type="spellEnd"/>
-      <w:r>
-        <w:t xml:space="preserve"> </w:t>
-      </w:r>
-      <w:proofErr w:type="spellStart"/>
-      <w:r>
-        <w:t>egy</w:t>
-      </w:r>
-      <w:proofErr w:type="spellEnd"/>
-      <w:r>
-        <w:t xml:space="preserve"> list</w:t>
+      <w:r>
+        <w:t>Visszaad egy list</w:t>
       </w:r>
       <w:r>
         <w:rPr>
@@ -1705,21 +986,11 @@
           <w:numId w:val="13"/>
         </w:numPr>
       </w:pPr>
-      <w:proofErr w:type="spellStart"/>
-      <w:r>
-        <w:t>DbApi.AddParkingSpot</w:t>
-      </w:r>
-      <w:proofErr w:type="spellEnd"/>
-      <w:r>
-        <w:t>(</w:t>
-      </w:r>
-      <w:proofErr w:type="spellStart"/>
-      <w:r>
-        <w:t>ParkingSpot</w:t>
-      </w:r>
-      <w:proofErr w:type="spellEnd"/>
-      <w:r>
-        <w:t xml:space="preserve"> spot): static async Task</w:t>
+      <w:r>
+        <w:t>Parking</w:t>
+      </w:r>
+      <w:r>
+        <w:t>DbApi.AddParkingSpot(ParkingSpot spot): static async Task</w:t>
       </w:r>
     </w:p>
     <w:p>
@@ -1730,11 +1001,9 @@
           <w:numId w:val="13"/>
         </w:numPr>
       </w:pPr>
-      <w:proofErr w:type="spellStart"/>
       <w:r>
         <w:t>Hozz</w:t>
       </w:r>
-      <w:proofErr w:type="spellEnd"/>
       <w:r>
         <w:rPr>
           <w:lang w:val="hu-HU"/>
@@ -1750,21 +1019,11 @@
           <w:numId w:val="13"/>
         </w:numPr>
       </w:pPr>
-      <w:proofErr w:type="spellStart"/>
-      <w:r>
-        <w:t>DbApi.RemoveParkingSpot</w:t>
-      </w:r>
-      <w:proofErr w:type="spellEnd"/>
-      <w:r>
-        <w:t>(</w:t>
-      </w:r>
-      <w:proofErr w:type="spellStart"/>
-      <w:r>
-        <w:t>ParkingSpot</w:t>
-      </w:r>
-      <w:proofErr w:type="spellEnd"/>
-      <w:r>
-        <w:t xml:space="preserve"> spot): static async Task</w:t>
+      <w:r>
+        <w:t>Parking</w:t>
+      </w:r>
+      <w:r>
+        <w:t>DbApi.RemoveParkingSpot(ParkingSpot spot): static async Task</w:t>
       </w:r>
     </w:p>
     <w:p>
@@ -1775,11 +1034,9 @@
           <w:numId w:val="13"/>
         </w:numPr>
       </w:pPr>
-      <w:proofErr w:type="spellStart"/>
       <w:r>
         <w:t>Kitörli</w:t>
       </w:r>
-      <w:proofErr w:type="spellEnd"/>
       <w:r>
         <w:rPr>
           <w:lang w:val="hu-HU"/>
@@ -1795,21 +1052,11 @@
           <w:numId w:val="13"/>
         </w:numPr>
       </w:pPr>
-      <w:proofErr w:type="spellStart"/>
-      <w:r>
-        <w:t>DbApi.AddReservation</w:t>
-      </w:r>
-      <w:proofErr w:type="spellEnd"/>
-      <w:r>
-        <w:t>(</w:t>
-      </w:r>
-      <w:proofErr w:type="spellStart"/>
-      <w:r>
-        <w:t>ParkingSpotReservation</w:t>
-      </w:r>
-      <w:proofErr w:type="spellEnd"/>
-      <w:r>
-        <w:t xml:space="preserve"> reservation): static async Task</w:t>
+      <w:r>
+        <w:t>Parking</w:t>
+      </w:r>
+      <w:r>
+        <w:t>DbApi.AddReservation(ParkingSpotReservation reservation): static async Task</w:t>
       </w:r>
     </w:p>
     <w:p>
@@ -1820,11 +1067,9 @@
           <w:numId w:val="13"/>
         </w:numPr>
       </w:pPr>
-      <w:proofErr w:type="spellStart"/>
       <w:r>
         <w:t>Hozz</w:t>
       </w:r>
-      <w:proofErr w:type="spellEnd"/>
       <w:r>
         <w:rPr>
           <w:lang w:val="hu-HU"/>
@@ -1840,21 +1085,11 @@
           <w:numId w:val="13"/>
         </w:numPr>
       </w:pPr>
-      <w:proofErr w:type="spellStart"/>
-      <w:r>
-        <w:t>DbApi.RemoveReservation</w:t>
-      </w:r>
-      <w:proofErr w:type="spellEnd"/>
-      <w:r>
-        <w:t>(</w:t>
-      </w:r>
-      <w:proofErr w:type="spellStart"/>
-      <w:r>
-        <w:t>ParkingSpotReservation</w:t>
-      </w:r>
-      <w:proofErr w:type="spellEnd"/>
-      <w:r>
-        <w:t xml:space="preserve"> reservation): static async Task</w:t>
+      <w:r>
+        <w:t>Parking</w:t>
+      </w:r>
+      <w:r>
+        <w:t>DbApi.RemoveReservation(ParkingSpotReservation reservation): static async Task</w:t>
       </w:r>
     </w:p>
     <w:p>
@@ -1865,11 +1100,9 @@
           <w:numId w:val="13"/>
         </w:numPr>
       </w:pPr>
-      <w:proofErr w:type="spellStart"/>
       <w:r>
         <w:t>Kitörli</w:t>
       </w:r>
-      <w:proofErr w:type="spellEnd"/>
       <w:r>
         <w:rPr>
           <w:lang w:val="hu-HU"/>
@@ -1899,14 +1132,15 @@
           <w:numId w:val="16"/>
         </w:numPr>
       </w:pPr>
-      <w:proofErr w:type="spellStart"/>
+      <w:r>
+        <w:t>Parkolóhely-foglaló.Core.</w:t>
+      </w:r>
       <w:r>
         <w:t>Controller.</w:t>
       </w:r>
       <w:r>
         <w:t>ReservationHandler</w:t>
       </w:r>
-      <w:proofErr w:type="spellEnd"/>
     </w:p>
     <w:p>
       <w:pPr>
@@ -1917,87 +1151,7 @@
         </w:numPr>
       </w:pPr>
       <w:r>
-        <w:t xml:space="preserve">Olyan </w:t>
-      </w:r>
-      <w:proofErr w:type="spellStart"/>
-      <w:r>
-        <w:t>műveletekért</w:t>
-      </w:r>
-      <w:proofErr w:type="spellEnd"/>
-      <w:r>
-        <w:t xml:space="preserve"> </w:t>
-      </w:r>
-      <w:proofErr w:type="spellStart"/>
-      <w:r>
-        <w:t>felelős</w:t>
-      </w:r>
-      <w:proofErr w:type="spellEnd"/>
-      <w:r>
-        <w:t xml:space="preserve">, </w:t>
-      </w:r>
-      <w:proofErr w:type="spellStart"/>
-      <w:r>
-        <w:t>melyek</w:t>
-      </w:r>
-      <w:proofErr w:type="spellEnd"/>
-      <w:r>
-        <w:t xml:space="preserve"> </w:t>
-      </w:r>
-      <w:proofErr w:type="spellStart"/>
-      <w:r>
-        <w:t>megerősítést</w:t>
-      </w:r>
-      <w:proofErr w:type="spellEnd"/>
-      <w:r>
-        <w:t xml:space="preserve"> </w:t>
-      </w:r>
-      <w:proofErr w:type="spellStart"/>
-      <w:r>
-        <w:t>kell</w:t>
-      </w:r>
-      <w:proofErr w:type="spellEnd"/>
-      <w:r>
-        <w:t xml:space="preserve"> </w:t>
-      </w:r>
-      <w:proofErr w:type="spellStart"/>
-      <w:r>
-        <w:t>kapjanak</w:t>
-      </w:r>
-      <w:proofErr w:type="spellEnd"/>
-      <w:r>
-        <w:t xml:space="preserve">, </w:t>
-      </w:r>
-      <w:proofErr w:type="spellStart"/>
-      <w:r>
-        <w:t>mielött</w:t>
-      </w:r>
-      <w:proofErr w:type="spellEnd"/>
-      <w:r>
-        <w:t xml:space="preserve"> </w:t>
-      </w:r>
-      <w:proofErr w:type="spellStart"/>
-      <w:r>
-        <w:t>hozzányúlhatnak</w:t>
-      </w:r>
-      <w:proofErr w:type="spellEnd"/>
-      <w:r>
-        <w:t xml:space="preserve"> </w:t>
-      </w:r>
-      <w:proofErr w:type="spellStart"/>
-      <w:r>
-        <w:t>az</w:t>
-      </w:r>
-      <w:proofErr w:type="spellEnd"/>
-      <w:r>
-        <w:t xml:space="preserve"> </w:t>
-      </w:r>
-      <w:proofErr w:type="spellStart"/>
-      <w:r>
-        <w:t>adatbázishoz</w:t>
-      </w:r>
-      <w:proofErr w:type="spellEnd"/>
-      <w:r>
-        <w:t>.</w:t>
+        <w:t>Olyan műveletekért felelős, melyek megerősítést kell kapjanak, mielött hozzányúlhatnak az adatbázishoz.</w:t>
       </w:r>
     </w:p>
     <w:p>
@@ -2008,58 +1162,8 @@
           <w:numId w:val="10"/>
         </w:numPr>
       </w:pPr>
-      <w:proofErr w:type="spellStart"/>
-      <w:proofErr w:type="gramStart"/>
-      <w:r>
-        <w:t>TryAddReservation</w:t>
-      </w:r>
-      <w:proofErr w:type="spellEnd"/>
-      <w:r>
-        <w:t>(</w:t>
-      </w:r>
-      <w:proofErr w:type="gramEnd"/>
-      <w:r>
-        <w:t xml:space="preserve">string user, </w:t>
-      </w:r>
-      <w:proofErr w:type="spellStart"/>
-      <w:r>
-        <w:t>ParkingSpot</w:t>
-      </w:r>
-      <w:proofErr w:type="spellEnd"/>
-      <w:r>
-        <w:t xml:space="preserve"> spot, </w:t>
-      </w:r>
-      <w:proofErr w:type="spellStart"/>
-      <w:r>
-        <w:t>DateTime</w:t>
-      </w:r>
-      <w:proofErr w:type="spellEnd"/>
-      <w:r>
-        <w:t xml:space="preserve"> </w:t>
-      </w:r>
-      <w:proofErr w:type="spellStart"/>
-      <w:r>
-        <w:t>startingTime</w:t>
-      </w:r>
-      <w:proofErr w:type="spellEnd"/>
-      <w:r>
-        <w:t xml:space="preserve">, </w:t>
-      </w:r>
-      <w:proofErr w:type="spellStart"/>
-      <w:r>
-        <w:t>DateTime</w:t>
-      </w:r>
-      <w:proofErr w:type="spellEnd"/>
-      <w:r>
-        <w:t xml:space="preserve"> </w:t>
-      </w:r>
-      <w:proofErr w:type="spellStart"/>
-      <w:r>
-        <w:t>endingTime</w:t>
-      </w:r>
-      <w:proofErr w:type="spellEnd"/>
-      <w:r>
-        <w:t>): static async Task</w:t>
+      <w:r>
+        <w:t>TryAddReservation(string user, ParkingSpot spot, DateTime startingTime, DateTime endingTime): static async Task</w:t>
       </w:r>
     </w:p>
     <w:p>
@@ -2131,6 +1235,7 @@
         <w:rPr>
           <w:lang w:val="hu-HU"/>
         </w:rPr>
+        <w:lastRenderedPageBreak/>
         <w:t>Ha elbukik, Exceptiont dob hibaüzenettel</w:t>
       </w:r>
     </w:p>
@@ -2143,104 +1248,7 @@
         </w:numPr>
       </w:pPr>
       <w:r>
-        <w:lastRenderedPageBreak/>
-        <w:t xml:space="preserve">Ha </w:t>
-      </w:r>
-      <w:proofErr w:type="spellStart"/>
-      <w:r>
-        <w:t>átment</w:t>
-      </w:r>
-      <w:proofErr w:type="spellEnd"/>
-      <w:r>
-        <w:t xml:space="preserve"> </w:t>
-      </w:r>
-      <w:proofErr w:type="spellStart"/>
-      <w:r>
-        <w:t>ezen</w:t>
-      </w:r>
-      <w:proofErr w:type="spellEnd"/>
-      <w:r>
-        <w:t xml:space="preserve"> a </w:t>
-      </w:r>
-      <w:proofErr w:type="spellStart"/>
-      <w:r>
-        <w:t>teszten</w:t>
-      </w:r>
-      <w:proofErr w:type="spellEnd"/>
-      <w:r>
-        <w:t xml:space="preserve">, </w:t>
-      </w:r>
-      <w:proofErr w:type="spellStart"/>
-      <w:r>
-        <w:t>létrehozza</w:t>
-      </w:r>
-      <w:proofErr w:type="spellEnd"/>
-      <w:r>
-        <w:t xml:space="preserve"> a </w:t>
-      </w:r>
-      <w:proofErr w:type="spellStart"/>
-      <w:r>
-        <w:t>ParkingSpotReservation</w:t>
-      </w:r>
-      <w:proofErr w:type="spellEnd"/>
-      <w:r>
-        <w:t xml:space="preserve"> </w:t>
-      </w:r>
-      <w:proofErr w:type="spellStart"/>
-      <w:r>
-        <w:t>objectumot</w:t>
-      </w:r>
-      <w:proofErr w:type="spellEnd"/>
-      <w:r>
-        <w:t xml:space="preserve">, </w:t>
-      </w:r>
-      <w:proofErr w:type="spellStart"/>
-      <w:r>
-        <w:t>és</w:t>
-      </w:r>
-      <w:proofErr w:type="spellEnd"/>
-      <w:r>
-        <w:t xml:space="preserve"> </w:t>
-      </w:r>
-      <w:proofErr w:type="spellStart"/>
-      <w:r>
-        <w:t>felveszi</w:t>
-      </w:r>
-      <w:proofErr w:type="spellEnd"/>
-      <w:r>
-        <w:t xml:space="preserve"> </w:t>
-      </w:r>
-      <w:proofErr w:type="spellStart"/>
-      <w:r>
-        <w:t>az</w:t>
-      </w:r>
-      <w:proofErr w:type="spellEnd"/>
-      <w:r>
-        <w:t xml:space="preserve"> </w:t>
-      </w:r>
-      <w:proofErr w:type="spellStart"/>
-      <w:r>
-        <w:t>adatbázisba</w:t>
-      </w:r>
-      <w:proofErr w:type="spellEnd"/>
-      <w:r>
-        <w:t xml:space="preserve">, </w:t>
-      </w:r>
-      <w:proofErr w:type="spellStart"/>
-      <w:r>
-        <w:t>az</w:t>
-      </w:r>
-      <w:proofErr w:type="spellEnd"/>
-      <w:r>
-        <w:t xml:space="preserve"> API-n </w:t>
-      </w:r>
-      <w:proofErr w:type="spellStart"/>
-      <w:r>
-        <w:t>keresztül</w:t>
-      </w:r>
-      <w:proofErr w:type="spellEnd"/>
-      <w:r>
-        <w:t>.</w:t>
+        <w:t>Ha átment ezen a teszten, létrehozza a ParkingSpotReservation objectumot, és felveszi az adatbázisba, az API-n keresztül.</w:t>
       </w:r>
     </w:p>
     <w:p>
@@ -2251,26 +1259,8 @@
           <w:numId w:val="10"/>
         </w:numPr>
       </w:pPr>
-      <w:proofErr w:type="spellStart"/>
-      <w:proofErr w:type="gramStart"/>
-      <w:r>
-        <w:t>TryRemoveReservation</w:t>
-      </w:r>
-      <w:proofErr w:type="spellEnd"/>
-      <w:r>
-        <w:t>(</w:t>
-      </w:r>
-      <w:proofErr w:type="gramEnd"/>
-      <w:r>
-        <w:t xml:space="preserve">string user, </w:t>
-      </w:r>
-      <w:proofErr w:type="spellStart"/>
-      <w:r>
-        <w:t>ParkingSpotReservation</w:t>
-      </w:r>
-      <w:proofErr w:type="spellEnd"/>
-      <w:r>
-        <w:t xml:space="preserve"> reservation): static async Task</w:t>
+      <w:r>
+        <w:t>TryRemoveReservation(string user, ParkingSpotReservation reservation): static async Task</w:t>
       </w:r>
     </w:p>
     <w:p>
@@ -2366,103 +1356,7 @@
         </w:numPr>
       </w:pPr>
       <w:r>
-        <w:t xml:space="preserve">Ha </w:t>
-      </w:r>
-      <w:proofErr w:type="spellStart"/>
-      <w:r>
-        <w:t>átment</w:t>
-      </w:r>
-      <w:proofErr w:type="spellEnd"/>
-      <w:r>
-        <w:t xml:space="preserve"> </w:t>
-      </w:r>
-      <w:proofErr w:type="spellStart"/>
-      <w:r>
-        <w:t>ezen</w:t>
-      </w:r>
-      <w:proofErr w:type="spellEnd"/>
-      <w:r>
-        <w:t xml:space="preserve"> a </w:t>
-      </w:r>
-      <w:proofErr w:type="spellStart"/>
-      <w:r>
-        <w:t>teszten</w:t>
-      </w:r>
-      <w:proofErr w:type="spellEnd"/>
-      <w:r>
-        <w:t xml:space="preserve">, </w:t>
-      </w:r>
-      <w:proofErr w:type="spellStart"/>
-      <w:r>
-        <w:t>létrehozza</w:t>
-      </w:r>
-      <w:proofErr w:type="spellEnd"/>
-      <w:r>
-        <w:t xml:space="preserve"> a </w:t>
-      </w:r>
-      <w:proofErr w:type="spellStart"/>
-      <w:r>
-        <w:t>ParkingSpotReservation</w:t>
-      </w:r>
-      <w:proofErr w:type="spellEnd"/>
-      <w:r>
-        <w:t xml:space="preserve"> </w:t>
-      </w:r>
-      <w:proofErr w:type="spellStart"/>
-      <w:r>
-        <w:t>objectumot</w:t>
-      </w:r>
-      <w:proofErr w:type="spellEnd"/>
-      <w:r>
-        <w:t xml:space="preserve">, </w:t>
-      </w:r>
-      <w:proofErr w:type="spellStart"/>
-      <w:r>
-        <w:t>és</w:t>
-      </w:r>
-      <w:proofErr w:type="spellEnd"/>
-      <w:r>
-        <w:t xml:space="preserve"> </w:t>
-      </w:r>
-      <w:proofErr w:type="spellStart"/>
-      <w:r>
-        <w:t>felveszi</w:t>
-      </w:r>
-      <w:proofErr w:type="spellEnd"/>
-      <w:r>
-        <w:t xml:space="preserve"> </w:t>
-      </w:r>
-      <w:proofErr w:type="spellStart"/>
-      <w:r>
-        <w:t>az</w:t>
-      </w:r>
-      <w:proofErr w:type="spellEnd"/>
-      <w:r>
-        <w:t xml:space="preserve"> </w:t>
-      </w:r>
-      <w:proofErr w:type="spellStart"/>
-      <w:r>
-        <w:t>adatbázisba</w:t>
-      </w:r>
-      <w:proofErr w:type="spellEnd"/>
-      <w:r>
-        <w:t xml:space="preserve">, </w:t>
-      </w:r>
-      <w:proofErr w:type="spellStart"/>
-      <w:r>
-        <w:t>az</w:t>
-      </w:r>
-      <w:proofErr w:type="spellEnd"/>
-      <w:r>
-        <w:t xml:space="preserve"> API-n </w:t>
-      </w:r>
-      <w:proofErr w:type="spellStart"/>
-      <w:r>
-        <w:t>keresztül</w:t>
-      </w:r>
-      <w:proofErr w:type="spellEnd"/>
-      <w:r>
-        <w:t>.</w:t>
+        <w:t>Ha átment ezen a teszten, létrehozza a ParkingSpotReservation objectumot, és felveszi az adatbázisba, az API-n keresztül.</w:t>
       </w:r>
     </w:p>
     <w:p/>

</xml_diff>